<commit_message>
Fig 2b: no band labels above 3000 cm-1
Co-Authored-By: Claude Opus 5.5 <noreply@anthropic.com>
Claude-Session: https://claude.ai/code/session_01L8hQ8e5u5KmaH4dD9snyRw
</commit_message>
<xml_diff>
--- a/Acacia_Fig2_MeanSD_Code.docx
+++ b/Acacia_Fig2_MeanSD_Code.docx
@@ -1515,32 +1515,6 @@
           <w:sz w:val="15"/>
           <w:noProof/>
         </w:rPr>
-        <w:t xml:space="preserve">    ('ch', 0, 'peak', 3050, 3080, '{p}', 'Proteins', True),              # aromatic =C-H</w:t>
-      </w:r>
-    </w:p>
-    <w:p>
-      <w:pPr>
-        <w:spacing w:before="0" w:after="0" w:line="240" w:lineRule="auto"/>
-      </w:pPr>
-      <w:r>
-        <w:rPr>
-          <w:rFonts w:ascii="Consolas" w:hAnsi="Consolas" w:eastAsia="Consolas" w:cs="Consolas"/>
-          <w:sz w:val="15"/>
-          <w:noProof/>
-        </w:rPr>
-        <w:t xml:space="preserve">    ('ch', 1, 'peak', 3050, 3085, '{p}', 'Proteins', False),</w:t>
-      </w:r>
-    </w:p>
-    <w:p>
-      <w:pPr>
-        <w:spacing w:before="0" w:after="0" w:line="240" w:lineRule="auto"/>
-      </w:pPr>
-      <w:r>
-        <w:rPr>
-          <w:rFonts w:ascii="Consolas" w:hAnsi="Consolas" w:eastAsia="Consolas" w:cs="Consolas"/>
-          <w:sz w:val="15"/>
-          <w:noProof/>
-        </w:rPr>
         <w:t xml:space="preserve">    ('ch', 1, 'shoulder', 2950, 2975, '~{p} sh', 'Proteins/Lipids', True),</w:t>
       </w:r>
     </w:p>
@@ -1555,6 +1529,19 @@
           <w:noProof/>
         </w:rPr>
         <w:t xml:space="preserve">    ('ch', 0, 'shoulder', 2845, 2860, '~{p}', 'Lipids', True),</w:t>
+      </w:r>
+    </w:p>
+    <w:p>
+      <w:pPr>
+        <w:spacing w:before="0" w:after="0" w:line="240" w:lineRule="auto"/>
+      </w:pPr>
+      <w:r>
+        <w:rPr>
+          <w:rFonts w:ascii="Consolas" w:hAnsi="Consolas" w:eastAsia="Consolas" w:cs="Consolas"/>
+          <w:sz w:val="15"/>
+          <w:noProof/>
+        </w:rPr>
+        <w:t xml:space="preserve">    # no labels above 3000 cm-1</w:t>
       </w:r>
     </w:p>
     <w:p>

</xml_diff>

<commit_message>
Fig 2a/2b: larger fonts, lines and spacing for print
Co-Authored-By: Claude Opus 5.5 <noreply@anthropic.com>
Claude-Session: https://claude.ai/code/session_01L8hQ8e5u5KmaH4dD9snyRw
</commit_message>
<xml_diff>
--- a/Acacia_Fig2_MeanSD_Code.docx
+++ b/Acacia_Fig2_MeanSD_Code.docx
@@ -156,20 +156,20 @@
           <w:sz w:val="15"/>
           <w:noProof/>
         </w:rPr>
-        <w:t># Same data, pre-processing, colours, offsets, fonts, figure size and 600 dpi</w:t>
-      </w:r>
-    </w:p>
-    <w:p>
-      <w:pPr>
-        <w:spacing w:before="0" w:after="0" w:line="240" w:lineRule="auto"/>
-      </w:pPr>
-      <w:r>
-        <w:rPr>
-          <w:rFonts w:ascii="Consolas" w:hAnsi="Consolas" w:eastAsia="Consolas" w:cs="Consolas"/>
-          <w:sz w:val="15"/>
-          <w:noProof/>
-        </w:rPr>
-        <w:t># export as Acacia_Paper_All.py; only the band labels differ (see LABELS below).</w:t>
+        <w:t># Same data, pre-processing and colours as Acacia_Paper_All.py; larger fonts, lines</w:t>
+      </w:r>
+    </w:p>
+    <w:p>
+      <w:pPr>
+        <w:spacing w:before="0" w:after="0" w:line="240" w:lineRule="auto"/>
+      </w:pPr>
+      <w:r>
+        <w:rPr>
+          <w:rFonts w:ascii="Consolas" w:hAnsi="Consolas" w:eastAsia="Consolas" w:cs="Consolas"/>
+          <w:sz w:val="15"/>
+          <w:noProof/>
+        </w:rPr>
+        <w:t># and offsets for print, and the band labels listed in LABELS below.</w:t>
       </w:r>
     </w:p>
     <w:p>
@@ -802,33 +802,59 @@
           <w:sz w:val="15"/>
           <w:noProof/>
         </w:rPr>
-        <w:t>OFFSET = {'fingerprint': 8.5, 'ch': 5.5}       # SNV units added to the NV spectrum</w:t>
-      </w:r>
-    </w:p>
-    <w:p>
-      <w:pPr>
-        <w:spacing w:before="0" w:after="0" w:line="240" w:lineRule="auto"/>
-      </w:pPr>
-      <w:r>
-        <w:rPr>
-          <w:rFonts w:ascii="Consolas" w:hAnsi="Consolas" w:eastAsia="Consolas" w:cs="Consolas"/>
-          <w:sz w:val="15"/>
-          <w:noProof/>
-        </w:rPr>
-        <w:t>TOP_ROOM = {'fingerprint': 4.3, 'ch': 4.4}     # space above the NV spectrum for labels</w:t>
-      </w:r>
-    </w:p>
-    <w:p>
-      <w:pPr>
-        <w:spacing w:before="0" w:after="0" w:line="240" w:lineRule="auto"/>
-      </w:pPr>
-      <w:r>
-        <w:rPr>
-          <w:rFonts w:ascii="Consolas" w:hAnsi="Consolas" w:eastAsia="Consolas" w:cs="Consolas"/>
-          <w:sz w:val="15"/>
-          <w:noProof/>
-        </w:rPr>
-        <w:t>LABEL_FS = 10</w:t>
+        <w:t>OFFSET = {'fingerprint': 12.0, 'ch': 6.5}      # SNV units added to the NV spectrum</w:t>
+      </w:r>
+    </w:p>
+    <w:p>
+      <w:pPr>
+        <w:spacing w:before="0" w:after="0" w:line="240" w:lineRule="auto"/>
+      </w:pPr>
+      <w:r>
+        <w:rPr>
+          <w:rFonts w:ascii="Consolas" w:hAnsi="Consolas" w:eastAsia="Consolas" w:cs="Consolas"/>
+          <w:sz w:val="15"/>
+          <w:noProof/>
+        </w:rPr>
+        <w:t>TOP_ROOM = {'fingerprint': 7.0, 'ch': 6.0}     # space above the NV spectrum for labels</w:t>
+      </w:r>
+    </w:p>
+    <w:p>
+      <w:pPr>
+        <w:spacing w:before="0" w:after="0" w:line="240" w:lineRule="auto"/>
+      </w:pPr>
+      <w:r>
+        <w:rPr>
+          <w:rFonts w:ascii="Consolas" w:hAnsi="Consolas" w:eastAsia="Consolas" w:cs="Consolas"/>
+          <w:sz w:val="15"/>
+          <w:noProof/>
+        </w:rPr>
+        <w:t># font sizes (pt), chosen to stay readable when the figure is reduced to one</w:t>
+      </w:r>
+    </w:p>
+    <w:p>
+      <w:pPr>
+        <w:spacing w:before="0" w:after="0" w:line="240" w:lineRule="auto"/>
+      </w:pPr>
+      <w:r>
+        <w:rPr>
+          <w:rFonts w:ascii="Consolas" w:hAnsi="Consolas" w:eastAsia="Consolas" w:cs="Consolas"/>
+          <w:sz w:val="15"/>
+          <w:noProof/>
+        </w:rPr>
+        <w:t># journal column</w:t>
+      </w:r>
+    </w:p>
+    <w:p>
+      <w:pPr>
+        <w:spacing w:before="0" w:after="0" w:line="240" w:lineRule="auto"/>
+      </w:pPr>
+      <w:r>
+        <w:rPr>
+          <w:rFonts w:ascii="Consolas" w:hAnsi="Consolas" w:eastAsia="Consolas" w:cs="Consolas"/>
+          <w:sz w:val="15"/>
+          <w:noProof/>
+        </w:rPr>
+        <w:t>LABEL_FS, AXIS_FS, TICK_FS = 13, 17, 15</w:t>
       </w:r>
     </w:p>
     <w:p>
@@ -1696,7 +1722,7 @@
           <w:sz w:val="15"/>
           <w:noProof/>
         </w:rPr>
-        <w:t xml:space="preserve">                     'font.size': 10})</w:t>
+        <w:t xml:space="preserve">                     'font.size': TICK_FS})</w:t>
       </w:r>
     </w:p>
     <w:p>
@@ -3977,7 +4003,7 @@
           <w:sz w:val="15"/>
           <w:noProof/>
         </w:rPr>
-        <w:t xml:space="preserve">        ax.plot(gs, mu + o, color=COLS[c], lw=1.0,</w:t>
+        <w:t xml:space="preserve">        ax.plot(gs, mu + o, color=COLS[c], lw=1.4,</w:t>
       </w:r>
     </w:p>
     <w:p>
@@ -4042,46 +4068,46 @@
           <w:sz w:val="15"/>
           <w:noProof/>
         </w:rPr>
-        <w:t xml:space="preserve">    ax.tick_params(axis='y', direction='in', length=5, labelleft=False)</w:t>
-      </w:r>
-    </w:p>
-    <w:p>
-      <w:pPr>
-        <w:spacing w:before="0" w:after="0" w:line="240" w:lineRule="auto"/>
-      </w:pPr>
-      <w:r>
-        <w:rPr>
-          <w:rFonts w:ascii="Consolas" w:hAnsi="Consolas" w:eastAsia="Consolas" w:cs="Consolas"/>
-          <w:sz w:val="15"/>
-          <w:noProof/>
-        </w:rPr>
-        <w:t xml:space="preserve">    ax.tick_params(axis='x', direction='in', length=5)</w:t>
-      </w:r>
-    </w:p>
-    <w:p>
-      <w:pPr>
-        <w:spacing w:before="0" w:after="0" w:line="240" w:lineRule="auto"/>
-      </w:pPr>
-      <w:r>
-        <w:rPr>
-          <w:rFonts w:ascii="Consolas" w:hAnsi="Consolas" w:eastAsia="Consolas" w:cs="Consolas"/>
-          <w:sz w:val="15"/>
-          <w:noProof/>
-        </w:rPr>
-        <w:t xml:space="preserve">    ax.set_xlabel('Raman Shift (cm$^{-1}$)', fontsize=13)</w:t>
-      </w:r>
-    </w:p>
-    <w:p>
-      <w:pPr>
-        <w:spacing w:before="0" w:after="0" w:line="240" w:lineRule="auto"/>
-      </w:pPr>
-      <w:r>
-        <w:rPr>
-          <w:rFonts w:ascii="Consolas" w:hAnsi="Consolas" w:eastAsia="Consolas" w:cs="Consolas"/>
-          <w:sz w:val="15"/>
-          <w:noProof/>
-        </w:rPr>
-        <w:t xml:space="preserve">    ax.set_ylabel('Intensity (a.u.)', fontsize=13)</w:t>
+        <w:t xml:space="preserve">    ax.tick_params(axis='y', direction='in', length=6, width=1.0, labelleft=False)</w:t>
+      </w:r>
+    </w:p>
+    <w:p>
+      <w:pPr>
+        <w:spacing w:before="0" w:after="0" w:line="240" w:lineRule="auto"/>
+      </w:pPr>
+      <w:r>
+        <w:rPr>
+          <w:rFonts w:ascii="Consolas" w:hAnsi="Consolas" w:eastAsia="Consolas" w:cs="Consolas"/>
+          <w:sz w:val="15"/>
+          <w:noProof/>
+        </w:rPr>
+        <w:t xml:space="preserve">    ax.tick_params(axis='x', direction='in', length=6, width=1.0, labelsize=TICK_FS)</w:t>
+      </w:r>
+    </w:p>
+    <w:p>
+      <w:pPr>
+        <w:spacing w:before="0" w:after="0" w:line="240" w:lineRule="auto"/>
+      </w:pPr>
+      <w:r>
+        <w:rPr>
+          <w:rFonts w:ascii="Consolas" w:hAnsi="Consolas" w:eastAsia="Consolas" w:cs="Consolas"/>
+          <w:sz w:val="15"/>
+          <w:noProof/>
+        </w:rPr>
+        <w:t xml:space="preserve">    ax.set_xlabel('Raman Shift (cm$^{-1}$)', fontsize=AXIS_FS)</w:t>
+      </w:r>
+    </w:p>
+    <w:p>
+      <w:pPr>
+        <w:spacing w:before="0" w:after="0" w:line="240" w:lineRule="auto"/>
+      </w:pPr>
+      <w:r>
+        <w:rPr>
+          <w:rFonts w:ascii="Consolas" w:hAnsi="Consolas" w:eastAsia="Consolas" w:cs="Consolas"/>
+          <w:sz w:val="15"/>
+          <w:noProof/>
+        </w:rPr>
+        <w:t xml:space="preserve">    ax.set_ylabel('Intensity (a.u.)', fontsize=AXIS_FS)</w:t>
       </w:r>
     </w:p>
     <w:p>
@@ -5479,20 +5505,20 @@
           <w:sz w:val="15"/>
           <w:noProof/>
         </w:rPr>
-        <w:t>make_figure('fingerprint', (400, 1790), (8.5, 6.5), 10, 'Fig2a_MeanSD_Fingerprint')</w:t>
-      </w:r>
-    </w:p>
-    <w:p>
-      <w:pPr>
-        <w:spacing w:before="0" w:after="0" w:line="240" w:lineRule="auto"/>
-      </w:pPr>
-      <w:r>
-        <w:rPr>
-          <w:rFonts w:ascii="Consolas" w:hAnsi="Consolas" w:eastAsia="Consolas" w:cs="Consolas"/>
-          <w:sz w:val="15"/>
-          <w:noProof/>
-        </w:rPr>
-        <w:t>make_figure('ch', (2760, 3095), (6.5, 6.0), 9, 'Fig2b_MeanSD_CH')</w:t>
+        <w:t>make_figure('fingerprint', (400, 1790), (8.5, 7.8), 13, 'Fig2a_MeanSD_Fingerprint')</w:t>
+      </w:r>
+    </w:p>
+    <w:p>
+      <w:pPr>
+        <w:spacing w:before="0" w:after="0" w:line="240" w:lineRule="auto"/>
+      </w:pPr>
+      <w:r>
+        <w:rPr>
+          <w:rFonts w:ascii="Consolas" w:hAnsi="Consolas" w:eastAsia="Consolas" w:cs="Consolas"/>
+          <w:sz w:val="15"/>
+          <w:noProof/>
+        </w:rPr>
+        <w:t>make_figure('ch', (2760, 3095), (7.0, 6.5), 12, 'Fig2b_MeanSD_CH')</w:t>
       </w:r>
     </w:p>
     <w:p>

</xml_diff>

<commit_message>
Fig 2a/2b: exactly the approved band labels (no extra labels), large fonts; shift shadows use the Table S4 maximum method
Co-Authored-By: Claude Opus 5.5 <noreply@anthropic.com>
Claude-Session: https://claude.ai/code/session_01L8hQ8e5u5KmaH4dD9snyRw
</commit_message>
<xml_diff>
--- a/Acacia_Fig2_MeanSD_Code.docx
+++ b/Acacia_Fig2_MeanSD_Code.docx
@@ -1112,462 +1112,332 @@
           <w:sz w:val="15"/>
           <w:noProof/>
         </w:rPr>
-        <w:t xml:space="preserve">    # --- Fig 2a, fingerprint: labels of the current version</w:t>
-      </w:r>
-    </w:p>
-    <w:p>
-      <w:pPr>
-        <w:spacing w:before="0" w:after="0" w:line="240" w:lineRule="auto"/>
-      </w:pPr>
-      <w:r>
-        <w:rPr>
-          <w:rFonts w:ascii="Consolas" w:hAnsi="Consolas" w:eastAsia="Consolas" w:cs="Consolas"/>
-          <w:sz w:val="15"/>
-          <w:noProof/>
-        </w:rPr>
-        <w:t xml:space="preserve">    ('fingerprint', 0, 'peak', 507, 531, '{p:.1f}', None, True),          # Si 518.5 (one decimal, as before)</w:t>
-      </w:r>
-    </w:p>
-    <w:p>
-      <w:pPr>
-        <w:spacing w:before="0" w:after="0" w:line="240" w:lineRule="auto"/>
-      </w:pPr>
-      <w:r>
-        <w:rPr>
-          <w:rFonts w:ascii="Consolas" w:hAnsi="Consolas" w:eastAsia="Consolas" w:cs="Consolas"/>
-          <w:sz w:val="15"/>
-          <w:noProof/>
-        </w:rPr>
-        <w:t xml:space="preserve">    ('fingerprint', 0, 'peak', 797, 821, '{p}', 'Nucleic Acids', True),</w:t>
-      </w:r>
-    </w:p>
-    <w:p>
-      <w:pPr>
-        <w:spacing w:before="0" w:after="0" w:line="240" w:lineRule="auto"/>
-      </w:pPr>
-      <w:r>
-        <w:rPr>
-          <w:rFonts w:ascii="Consolas" w:hAnsi="Consolas" w:eastAsia="Consolas" w:cs="Consolas"/>
-          <w:sz w:val="15"/>
-          <w:noProof/>
-        </w:rPr>
-        <w:t xml:space="preserve">    ('fingerprint', 0, 'peak', 843, 867, '{p}', 'Proteins', True),</w:t>
-      </w:r>
-    </w:p>
-    <w:p>
-      <w:pPr>
-        <w:spacing w:before="0" w:after="0" w:line="240" w:lineRule="auto"/>
-      </w:pPr>
-      <w:r>
-        <w:rPr>
-          <w:rFonts w:ascii="Consolas" w:hAnsi="Consolas" w:eastAsia="Consolas" w:cs="Consolas"/>
-          <w:sz w:val="15"/>
-          <w:noProof/>
-        </w:rPr>
-        <w:t xml:space="preserve">    ('fingerprint', 0, 'peak', 919, 943, '{p}', 'Proteins', True),</w:t>
-      </w:r>
-    </w:p>
-    <w:p>
-      <w:pPr>
-        <w:spacing w:before="0" w:after="0" w:line="240" w:lineRule="auto"/>
-      </w:pPr>
-      <w:r>
-        <w:rPr>
-          <w:rFonts w:ascii="Consolas" w:hAnsi="Consolas" w:eastAsia="Consolas" w:cs="Consolas"/>
-          <w:sz w:val="15"/>
-          <w:noProof/>
-        </w:rPr>
-        <w:t xml:space="preserve">    ('fingerprint', 0, 'peak', 989, 1013, '{p}', 'Proteins', True),</w:t>
-      </w:r>
-    </w:p>
-    <w:p>
-      <w:pPr>
-        <w:spacing w:before="0" w:after="0" w:line="240" w:lineRule="auto"/>
-      </w:pPr>
-      <w:r>
-        <w:rPr>
-          <w:rFonts w:ascii="Consolas" w:hAnsi="Consolas" w:eastAsia="Consolas" w:cs="Consolas"/>
-          <w:sz w:val="15"/>
-          <w:noProof/>
-        </w:rPr>
-        <w:t xml:space="preserve">    ('fingerprint', 0, 'peak', 1149, 1173, '{p}', 'Proteins', True),</w:t>
-      </w:r>
-    </w:p>
-    <w:p>
-      <w:pPr>
-        <w:spacing w:before="0" w:after="0" w:line="240" w:lineRule="auto"/>
-      </w:pPr>
-      <w:r>
-        <w:rPr>
-          <w:rFonts w:ascii="Consolas" w:hAnsi="Consolas" w:eastAsia="Consolas" w:cs="Consolas"/>
-          <w:sz w:val="15"/>
-          <w:noProof/>
-        </w:rPr>
-        <w:t xml:space="preserve">    ('fingerprint', 0, 'peak', 1237, 1261, '{p}', 'Proteins', True),</w:t>
-      </w:r>
-    </w:p>
-    <w:p>
-      <w:pPr>
-        <w:spacing w:before="0" w:after="0" w:line="240" w:lineRule="auto"/>
-      </w:pPr>
-      <w:r>
-        <w:rPr>
-          <w:rFonts w:ascii="Consolas" w:hAnsi="Consolas" w:eastAsia="Consolas" w:cs="Consolas"/>
-          <w:sz w:val="15"/>
-          <w:noProof/>
-        </w:rPr>
-        <w:t xml:space="preserve">    ('fingerprint', 0, 'peak', 1361, 1385, '{p}', 'Lipids/NA', True),</w:t>
-      </w:r>
-    </w:p>
-    <w:p>
-      <w:pPr>
-        <w:spacing w:before="0" w:after="0" w:line="240" w:lineRule="auto"/>
-      </w:pPr>
-      <w:r>
-        <w:rPr>
-          <w:rFonts w:ascii="Consolas" w:hAnsi="Consolas" w:eastAsia="Consolas" w:cs="Consolas"/>
-          <w:sz w:val="15"/>
-          <w:noProof/>
-        </w:rPr>
-        <w:t xml:space="preserve">    ('fingerprint', 0, 'peak', 1591, 1615, '{p}', 'Proteins', True),</w:t>
-      </w:r>
-    </w:p>
-    <w:p>
-      <w:pPr>
-        <w:spacing w:before="0" w:after="0" w:line="240" w:lineRule="auto"/>
-      </w:pPr>
-      <w:r>
-        <w:rPr>
-          <w:rFonts w:ascii="Consolas" w:hAnsi="Consolas" w:eastAsia="Consolas" w:cs="Consolas"/>
-          <w:sz w:val="15"/>
-          <w:noProof/>
-        </w:rPr>
-        <w:t xml:space="preserve">    ('fingerprint', 1, 'peak', 507, 531, '{p:.1f}', None, True),</w:t>
-      </w:r>
-    </w:p>
-    <w:p>
-      <w:pPr>
-        <w:spacing w:before="0" w:after="0" w:line="240" w:lineRule="auto"/>
-      </w:pPr>
-      <w:r>
-        <w:rPr>
-          <w:rFonts w:ascii="Consolas" w:hAnsi="Consolas" w:eastAsia="Consolas" w:cs="Consolas"/>
-          <w:sz w:val="15"/>
-          <w:noProof/>
-        </w:rPr>
-        <w:t xml:space="preserve">    ('fingerprint', 1, 'peak', 787, 811, '{p}', 'Nucleic Acids', True),</w:t>
-      </w:r>
-    </w:p>
-    <w:p>
-      <w:pPr>
-        <w:spacing w:before="0" w:after="0" w:line="240" w:lineRule="auto"/>
-      </w:pPr>
-      <w:r>
-        <w:rPr>
-          <w:rFonts w:ascii="Consolas" w:hAnsi="Consolas" w:eastAsia="Consolas" w:cs="Consolas"/>
-          <w:sz w:val="15"/>
-          <w:noProof/>
-        </w:rPr>
-        <w:t xml:space="preserve">    ('fingerprint', 1, 'peak', 817, 841, '{p}', 'Proteins', True),</w:t>
-      </w:r>
-    </w:p>
-    <w:p>
-      <w:pPr>
-        <w:spacing w:before="0" w:after="0" w:line="240" w:lineRule="auto"/>
-      </w:pPr>
-      <w:r>
-        <w:rPr>
-          <w:rFonts w:ascii="Consolas" w:hAnsi="Consolas" w:eastAsia="Consolas" w:cs="Consolas"/>
-          <w:sz w:val="15"/>
-          <w:noProof/>
-        </w:rPr>
-        <w:t xml:space="preserve">    ('fingerprint', 1, 'peak', 915, 939, '{p}', 'Proteins', True),</w:t>
-      </w:r>
-    </w:p>
-    <w:p>
-      <w:pPr>
-        <w:spacing w:before="0" w:after="0" w:line="240" w:lineRule="auto"/>
-      </w:pPr>
-      <w:r>
-        <w:rPr>
-          <w:rFonts w:ascii="Consolas" w:hAnsi="Consolas" w:eastAsia="Consolas" w:cs="Consolas"/>
-          <w:sz w:val="15"/>
-          <w:noProof/>
-        </w:rPr>
-        <w:t xml:space="preserve">    ('fingerprint', 1, 'peak', 989, 1013, '{p}', 'Proteins', True),</w:t>
-      </w:r>
-    </w:p>
-    <w:p>
-      <w:pPr>
-        <w:spacing w:before="0" w:after="0" w:line="240" w:lineRule="auto"/>
-      </w:pPr>
-      <w:r>
-        <w:rPr>
-          <w:rFonts w:ascii="Consolas" w:hAnsi="Consolas" w:eastAsia="Consolas" w:cs="Consolas"/>
-          <w:sz w:val="15"/>
-          <w:noProof/>
-        </w:rPr>
-        <w:t xml:space="preserve">    ('fingerprint', 1, 'peak', 1021, 1045, '{p}', 'Proteins', True),</w:t>
-      </w:r>
-    </w:p>
-    <w:p>
-      <w:pPr>
-        <w:spacing w:before="0" w:after="0" w:line="240" w:lineRule="auto"/>
-      </w:pPr>
-      <w:r>
-        <w:rPr>
-          <w:rFonts w:ascii="Consolas" w:hAnsi="Consolas" w:eastAsia="Consolas" w:cs="Consolas"/>
-          <w:sz w:val="15"/>
-          <w:noProof/>
-        </w:rPr>
-        <w:t xml:space="preserve">    ('fingerprint', 1, 'peak', 1157, 1181, '{p}', 'Proteins', True),</w:t>
-      </w:r>
-    </w:p>
-    <w:p>
-      <w:pPr>
-        <w:spacing w:before="0" w:after="0" w:line="240" w:lineRule="auto"/>
-      </w:pPr>
-      <w:r>
-        <w:rPr>
-          <w:rFonts w:ascii="Consolas" w:hAnsi="Consolas" w:eastAsia="Consolas" w:cs="Consolas"/>
-          <w:sz w:val="15"/>
-          <w:noProof/>
-        </w:rPr>
-        <w:t xml:space="preserve">    ('fingerprint', 1, 'peak', 1233, 1257, '{p}', 'Proteins', True),</w:t>
-      </w:r>
-    </w:p>
-    <w:p>
-      <w:pPr>
-        <w:spacing w:before="0" w:after="0" w:line="240" w:lineRule="auto"/>
-      </w:pPr>
-      <w:r>
-        <w:rPr>
-          <w:rFonts w:ascii="Consolas" w:hAnsi="Consolas" w:eastAsia="Consolas" w:cs="Consolas"/>
-          <w:sz w:val="15"/>
-          <w:noProof/>
-        </w:rPr>
-        <w:t xml:space="preserve">    ('fingerprint', 1, 'peak', 1373, 1397, '{p}', 'Lipids/NA', True),</w:t>
-      </w:r>
-    </w:p>
-    <w:p>
-      <w:pPr>
-        <w:spacing w:before="0" w:after="0" w:line="240" w:lineRule="auto"/>
-      </w:pPr>
-      <w:r>
-        <w:rPr>
-          <w:rFonts w:ascii="Consolas" w:hAnsi="Consolas" w:eastAsia="Consolas" w:cs="Consolas"/>
-          <w:sz w:val="15"/>
-          <w:noProof/>
-        </w:rPr>
-        <w:t xml:space="preserve">    ('fingerprint', 1, 'peak', 1595, 1619, '{p}', 'Proteins', True),</w:t>
-      </w:r>
-    </w:p>
-    <w:p>
-      <w:pPr>
-        <w:spacing w:before="0" w:after="0" w:line="240" w:lineRule="auto"/>
-      </w:pPr>
-      <w:r>
-        <w:rPr>
-          <w:rFonts w:ascii="Consolas" w:hAnsi="Consolas" w:eastAsia="Consolas" w:cs="Consolas"/>
-          <w:sz w:val="15"/>
-          <w:noProof/>
-        </w:rPr>
-        <w:t xml:space="preserve">    # --- Fig 2a, new labels</w:t>
-      </w:r>
-    </w:p>
-    <w:p>
-      <w:pPr>
-        <w:spacing w:before="0" w:after="0" w:line="240" w:lineRule="auto"/>
-      </w:pPr>
-      <w:r>
-        <w:rPr>
-          <w:rFonts w:ascii="Consolas" w:hAnsi="Consolas" w:eastAsia="Consolas" w:cs="Consolas"/>
-          <w:sz w:val="15"/>
-          <w:noProof/>
-        </w:rPr>
-        <w:t xml:space="preserve">    ('fingerprint', 0, 'shoulder', 1560, 1585, '~{p} sh', 'Proteins (COO$^{-}$)', True),</w:t>
-      </w:r>
-    </w:p>
-    <w:p>
-      <w:pPr>
-        <w:spacing w:before="0" w:after="0" w:line="240" w:lineRule="auto"/>
-      </w:pPr>
-      <w:r>
-        <w:rPr>
-          <w:rFonts w:ascii="Consolas" w:hAnsi="Consolas" w:eastAsia="Consolas" w:cs="Consolas"/>
-          <w:sz w:val="15"/>
-          <w:noProof/>
-        </w:rPr>
-        <w:t xml:space="preserve">    ('fingerprint', 1, 'shoulder', 1620, 1640, '~{p} sh', None, True),</w:t>
-      </w:r>
-    </w:p>
-    <w:p>
-      <w:pPr>
-        <w:spacing w:before="0" w:after="0" w:line="240" w:lineRule="auto"/>
-      </w:pPr>
-      <w:r>
-        <w:rPr>
-          <w:rFonts w:ascii="Consolas" w:hAnsi="Consolas" w:eastAsia="Consolas" w:cs="Consolas"/>
-          <w:sz w:val="15"/>
-          <w:noProof/>
-        </w:rPr>
-        <w:t xml:space="preserve">    ('fingerprint', 0, 'shoulder', 1490, 1510, '~{p}', None, True),</w:t>
-      </w:r>
-    </w:p>
-    <w:p>
-      <w:pPr>
-        <w:spacing w:before="0" w:after="0" w:line="240" w:lineRule="auto"/>
-      </w:pPr>
-      <w:r>
-        <w:rPr>
-          <w:rFonts w:ascii="Consolas" w:hAnsi="Consolas" w:eastAsia="Consolas" w:cs="Consolas"/>
-          <w:sz w:val="15"/>
-          <w:noProof/>
-        </w:rPr>
-        <w:t xml:space="preserve">    ('fingerprint', 0, 'peak', 822, 835, '{p}', 'Proteins', True),       # weak Tyr band</w:t>
-      </w:r>
-    </w:p>
-    <w:p>
-      <w:pPr>
-        <w:spacing w:before="0" w:after="0" w:line="240" w:lineRule="auto"/>
-      </w:pPr>
-      <w:r>
-        <w:rPr>
-          <w:rFonts w:ascii="Consolas" w:hAnsi="Consolas" w:eastAsia="Consolas" w:cs="Consolas"/>
-          <w:sz w:val="15"/>
-          <w:noProof/>
-        </w:rPr>
-        <w:t xml:space="preserve">    ('fingerprint', 1, 'peak', 850, 860, '{p}', 'Proteins', False),      # weak Tyr band, if present</w:t>
-      </w:r>
-    </w:p>
-    <w:p>
-      <w:pPr>
-        <w:spacing w:before="0" w:after="0" w:line="240" w:lineRule="auto"/>
-      </w:pPr>
-      <w:r>
-        <w:rPr>
-          <w:rFonts w:ascii="Consolas" w:hAnsi="Consolas" w:eastAsia="Consolas" w:cs="Consolas"/>
-          <w:sz w:val="15"/>
-          <w:noProof/>
-        </w:rPr>
-        <w:t xml:space="preserve">    ('fingerprint', 0, 'peak', 1715, 1740, '{p}', 'Lipids', 'both1728'),  # only if present in EV AND NV</w:t>
-      </w:r>
-    </w:p>
-    <w:p>
-      <w:pPr>
-        <w:spacing w:before="0" w:after="0" w:line="240" w:lineRule="auto"/>
-      </w:pPr>
-      <w:r>
-        <w:rPr>
-          <w:rFonts w:ascii="Consolas" w:hAnsi="Consolas" w:eastAsia="Consolas" w:cs="Consolas"/>
-          <w:sz w:val="15"/>
-          <w:noProof/>
-        </w:rPr>
-        <w:t xml:space="preserve">    ('fingerprint', 1, 'peak', 1715, 1740, '{p}', 'Lipids', 'both1728'),</w:t>
-      </w:r>
-    </w:p>
-    <w:p>
-      <w:pPr>
-        <w:spacing w:before="0" w:after="0" w:line="240" w:lineRule="auto"/>
-      </w:pPr>
-      <w:r>
-        <w:rPr>
-          <w:rFonts w:ascii="Consolas" w:hAnsi="Consolas" w:eastAsia="Consolas" w:cs="Consolas"/>
-          <w:sz w:val="15"/>
-          <w:noProof/>
-        </w:rPr>
-        <w:t xml:space="preserve">    # --- Fig 2b, CH region</w:t>
-      </w:r>
-    </w:p>
-    <w:p>
-      <w:pPr>
-        <w:spacing w:before="0" w:after="0" w:line="240" w:lineRule="auto"/>
-      </w:pPr>
-      <w:r>
-        <w:rPr>
-          <w:rFonts w:ascii="Consolas" w:hAnsi="Consolas" w:eastAsia="Consolas" w:cs="Consolas"/>
-          <w:sz w:val="15"/>
-          <w:noProof/>
-        </w:rPr>
-        <w:t xml:space="preserve">    ('ch', 0, 'shoulder', 2868, 2892, '{p}', 'Lipids/Proteins', True),   # 2874 (current label, new class)</w:t>
-      </w:r>
-    </w:p>
-    <w:p>
-      <w:pPr>
-        <w:spacing w:before="0" w:after="0" w:line="240" w:lineRule="auto"/>
-      </w:pPr>
-      <w:r>
-        <w:rPr>
-          <w:rFonts w:ascii="Consolas" w:hAnsi="Consolas" w:eastAsia="Consolas" w:cs="Consolas"/>
-          <w:sz w:val="15"/>
-          <w:noProof/>
-        </w:rPr>
-        <w:t xml:space="preserve">    ('ch', 1, 'shoulder', 2868, 2892, '{p}', 'Lipids/Proteins', True),   # 2883</w:t>
-      </w:r>
-    </w:p>
-    <w:p>
-      <w:pPr>
-        <w:spacing w:before="0" w:after="0" w:line="240" w:lineRule="auto"/>
-      </w:pPr>
-      <w:r>
-        <w:rPr>
-          <w:rFonts w:ascii="Consolas" w:hAnsi="Consolas" w:eastAsia="Consolas" w:cs="Consolas"/>
-          <w:sz w:val="15"/>
-          <w:noProof/>
-        </w:rPr>
-        <w:t xml:space="preserve">    ('ch', 0, 'peak', 2923, 2947, '{p}', 'Proteins', True),              # 2933</w:t>
-      </w:r>
-    </w:p>
-    <w:p>
-      <w:pPr>
-        <w:spacing w:before="0" w:after="0" w:line="240" w:lineRule="auto"/>
-      </w:pPr>
-      <w:r>
-        <w:rPr>
-          <w:rFonts w:ascii="Consolas" w:hAnsi="Consolas" w:eastAsia="Consolas" w:cs="Consolas"/>
-          <w:sz w:val="15"/>
-          <w:noProof/>
-        </w:rPr>
-        <w:t xml:space="preserve">    ('ch', 1, 'peak', 2923, 2947, '{p}', 'Proteins', True),              # 2937</w:t>
-      </w:r>
-    </w:p>
-    <w:p>
-      <w:pPr>
-        <w:spacing w:before="0" w:after="0" w:line="240" w:lineRule="auto"/>
-      </w:pPr>
-      <w:r>
-        <w:rPr>
-          <w:rFonts w:ascii="Consolas" w:hAnsi="Consolas" w:eastAsia="Consolas" w:cs="Consolas"/>
-          <w:sz w:val="15"/>
-          <w:noProof/>
-        </w:rPr>
-        <w:t xml:space="preserve">    ('ch', 1, 'shoulder', 2950, 2975, '~{p} sh', 'Proteins/Lipids', True),</w:t>
-      </w:r>
-    </w:p>
-    <w:p>
-      <w:pPr>
-        <w:spacing w:before="0" w:after="0" w:line="240" w:lineRule="auto"/>
-      </w:pPr>
-      <w:r>
-        <w:rPr>
-          <w:rFonts w:ascii="Consolas" w:hAnsi="Consolas" w:eastAsia="Consolas" w:cs="Consolas"/>
-          <w:sz w:val="15"/>
-          <w:noProof/>
-        </w:rPr>
-        <w:t xml:space="preserve">    ('ch', 0, 'shoulder', 2845, 2860, '~{p}', 'Lipids', True),</w:t>
-      </w:r>
-    </w:p>
-    <w:p>
-      <w:pPr>
-        <w:spacing w:before="0" w:after="0" w:line="240" w:lineRule="auto"/>
-      </w:pPr>
-      <w:r>
-        <w:rPr>
-          <w:rFonts w:ascii="Consolas" w:hAnsi="Consolas" w:eastAsia="Consolas" w:cs="Consolas"/>
-          <w:sz w:val="15"/>
-          <w:noProof/>
-        </w:rPr>
-        <w:t xml:space="preserve">    # no labels above 3000 cm-1</w:t>
+        <w:t xml:space="preserve">    # --- Fig 2a, fingerprint (exactly the labels of the approved figure)</w:t>
+      </w:r>
+    </w:p>
+    <w:p>
+      <w:pPr>
+        <w:spacing w:before="0" w:after="0" w:line="240" w:lineRule="auto"/>
+      </w:pPr>
+      <w:r>
+        <w:rPr>
+          <w:rFonts w:ascii="Consolas" w:hAnsi="Consolas" w:eastAsia="Consolas" w:cs="Consolas"/>
+          <w:sz w:val="15"/>
+          <w:noProof/>
+        </w:rPr>
+        <w:t xml:space="preserve">    ('fingerprint', 0, 'peak', 507, 531, '{p:.1f}', None, True),          # Si 518.5</w:t>
+      </w:r>
+    </w:p>
+    <w:p>
+      <w:pPr>
+        <w:spacing w:before="0" w:after="0" w:line="240" w:lineRule="auto"/>
+      </w:pPr>
+      <w:r>
+        <w:rPr>
+          <w:rFonts w:ascii="Consolas" w:hAnsi="Consolas" w:eastAsia="Consolas" w:cs="Consolas"/>
+          <w:sz w:val="15"/>
+          <w:noProof/>
+        </w:rPr>
+        <w:t xml:space="preserve">    ('fingerprint', 0, 'peak', 797, 821, '{p}', 'Nucleic Acids', True),   # 809</w:t>
+      </w:r>
+    </w:p>
+    <w:p>
+      <w:pPr>
+        <w:spacing w:before="0" w:after="0" w:line="240" w:lineRule="auto"/>
+      </w:pPr>
+      <w:r>
+        <w:rPr>
+          <w:rFonts w:ascii="Consolas" w:hAnsi="Consolas" w:eastAsia="Consolas" w:cs="Consolas"/>
+          <w:sz w:val="15"/>
+          <w:noProof/>
+        </w:rPr>
+        <w:t xml:space="preserve">    ('fingerprint', 0, 'peak', 843, 867, '{p}', 'Proteins', True),        # 855</w:t>
+      </w:r>
+    </w:p>
+    <w:p>
+      <w:pPr>
+        <w:spacing w:before="0" w:after="0" w:line="240" w:lineRule="auto"/>
+      </w:pPr>
+      <w:r>
+        <w:rPr>
+          <w:rFonts w:ascii="Consolas" w:hAnsi="Consolas" w:eastAsia="Consolas" w:cs="Consolas"/>
+          <w:sz w:val="15"/>
+          <w:noProof/>
+        </w:rPr>
+        <w:t xml:space="preserve">    ('fingerprint', 0, 'peak', 919, 943, '{p}', 'Proteins', True),        # 932</w:t>
+      </w:r>
+    </w:p>
+    <w:p>
+      <w:pPr>
+        <w:spacing w:before="0" w:after="0" w:line="240" w:lineRule="auto"/>
+      </w:pPr>
+      <w:r>
+        <w:rPr>
+          <w:rFonts w:ascii="Consolas" w:hAnsi="Consolas" w:eastAsia="Consolas" w:cs="Consolas"/>
+          <w:sz w:val="15"/>
+          <w:noProof/>
+        </w:rPr>
+        <w:t xml:space="preserve">    ('fingerprint', 0, 'peak', 989, 1013, '{p}', 'Proteins', True),       # 1002</w:t>
+      </w:r>
+    </w:p>
+    <w:p>
+      <w:pPr>
+        <w:spacing w:before="0" w:after="0" w:line="240" w:lineRule="auto"/>
+      </w:pPr>
+      <w:r>
+        <w:rPr>
+          <w:rFonts w:ascii="Consolas" w:hAnsi="Consolas" w:eastAsia="Consolas" w:cs="Consolas"/>
+          <w:sz w:val="15"/>
+          <w:noProof/>
+        </w:rPr>
+        <w:t xml:space="preserve">    ('fingerprint', 0, 'peak', 1149, 1173, '{p}', 'Proteins', True),      # 1162</w:t>
+      </w:r>
+    </w:p>
+    <w:p>
+      <w:pPr>
+        <w:spacing w:before="0" w:after="0" w:line="240" w:lineRule="auto"/>
+      </w:pPr>
+      <w:r>
+        <w:rPr>
+          <w:rFonts w:ascii="Consolas" w:hAnsi="Consolas" w:eastAsia="Consolas" w:cs="Consolas"/>
+          <w:sz w:val="15"/>
+          <w:noProof/>
+        </w:rPr>
+        <w:t xml:space="preserve">    ('fingerprint', 0, 'peak', 1237, 1261, '{p}', 'Proteins', True),      # 1249</w:t>
+      </w:r>
+    </w:p>
+    <w:p>
+      <w:pPr>
+        <w:spacing w:before="0" w:after="0" w:line="240" w:lineRule="auto"/>
+      </w:pPr>
+      <w:r>
+        <w:rPr>
+          <w:rFonts w:ascii="Consolas" w:hAnsi="Consolas" w:eastAsia="Consolas" w:cs="Consolas"/>
+          <w:sz w:val="15"/>
+          <w:noProof/>
+        </w:rPr>
+        <w:t xml:space="preserve">    ('fingerprint', 0, 'peak', 1361, 1385, '{p}', 'Lipids/NA', True),     # 1373</w:t>
+      </w:r>
+    </w:p>
+    <w:p>
+      <w:pPr>
+        <w:spacing w:before="0" w:after="0" w:line="240" w:lineRule="auto"/>
+      </w:pPr>
+      <w:r>
+        <w:rPr>
+          <w:rFonts w:ascii="Consolas" w:hAnsi="Consolas" w:eastAsia="Consolas" w:cs="Consolas"/>
+          <w:sz w:val="15"/>
+          <w:noProof/>
+        </w:rPr>
+        <w:t xml:space="preserve">    ('fingerprint', 0, 'peak', 1591, 1615, '{p}', 'Proteins', True),      # 1603</w:t>
+      </w:r>
+    </w:p>
+    <w:p>
+      <w:pPr>
+        <w:spacing w:before="0" w:after="0" w:line="240" w:lineRule="auto"/>
+      </w:pPr>
+      <w:r>
+        <w:rPr>
+          <w:rFonts w:ascii="Consolas" w:hAnsi="Consolas" w:eastAsia="Consolas" w:cs="Consolas"/>
+          <w:sz w:val="15"/>
+          <w:noProof/>
+        </w:rPr>
+        <w:t xml:space="preserve">    ('fingerprint', 1, 'peak', 507, 531, '{p:.1f}', None, True),          # Si 518.1</w:t>
+      </w:r>
+    </w:p>
+    <w:p>
+      <w:pPr>
+        <w:spacing w:before="0" w:after="0" w:line="240" w:lineRule="auto"/>
+      </w:pPr>
+      <w:r>
+        <w:rPr>
+          <w:rFonts w:ascii="Consolas" w:hAnsi="Consolas" w:eastAsia="Consolas" w:cs="Consolas"/>
+          <w:sz w:val="15"/>
+          <w:noProof/>
+        </w:rPr>
+        <w:t xml:space="preserve">    ('fingerprint', 1, 'peak', 787, 811, '{p}', 'Nucleic Acids', True),   # 799</w:t>
+      </w:r>
+    </w:p>
+    <w:p>
+      <w:pPr>
+        <w:spacing w:before="0" w:after="0" w:line="240" w:lineRule="auto"/>
+      </w:pPr>
+      <w:r>
+        <w:rPr>
+          <w:rFonts w:ascii="Consolas" w:hAnsi="Consolas" w:eastAsia="Consolas" w:cs="Consolas"/>
+          <w:sz w:val="15"/>
+          <w:noProof/>
+        </w:rPr>
+        <w:t xml:space="preserve">    ('fingerprint', 1, 'peak', 817, 841, '{p}', 'Proteins', True),        # 829</w:t>
+      </w:r>
+    </w:p>
+    <w:p>
+      <w:pPr>
+        <w:spacing w:before="0" w:after="0" w:line="240" w:lineRule="auto"/>
+      </w:pPr>
+      <w:r>
+        <w:rPr>
+          <w:rFonts w:ascii="Consolas" w:hAnsi="Consolas" w:eastAsia="Consolas" w:cs="Consolas"/>
+          <w:sz w:val="15"/>
+          <w:noProof/>
+        </w:rPr>
+        <w:t xml:space="preserve">    ('fingerprint', 1, 'peak', 915, 939, '{p}', 'Proteins', True),        # 927</w:t>
+      </w:r>
+    </w:p>
+    <w:p>
+      <w:pPr>
+        <w:spacing w:before="0" w:after="0" w:line="240" w:lineRule="auto"/>
+      </w:pPr>
+      <w:r>
+        <w:rPr>
+          <w:rFonts w:ascii="Consolas" w:hAnsi="Consolas" w:eastAsia="Consolas" w:cs="Consolas"/>
+          <w:sz w:val="15"/>
+          <w:noProof/>
+        </w:rPr>
+        <w:t xml:space="preserve">    ('fingerprint', 1, 'peak', 989, 1013, '{p}', 'Proteins', True),       # 1001</w:t>
+      </w:r>
+    </w:p>
+    <w:p>
+      <w:pPr>
+        <w:spacing w:before="0" w:after="0" w:line="240" w:lineRule="auto"/>
+      </w:pPr>
+      <w:r>
+        <w:rPr>
+          <w:rFonts w:ascii="Consolas" w:hAnsi="Consolas" w:eastAsia="Consolas" w:cs="Consolas"/>
+          <w:sz w:val="15"/>
+          <w:noProof/>
+        </w:rPr>
+        <w:t xml:space="preserve">    ('fingerprint', 1, 'peak', 1021, 1045, '{p}', 'Proteins', True),      # 1033</w:t>
+      </w:r>
+    </w:p>
+    <w:p>
+      <w:pPr>
+        <w:spacing w:before="0" w:after="0" w:line="240" w:lineRule="auto"/>
+      </w:pPr>
+      <w:r>
+        <w:rPr>
+          <w:rFonts w:ascii="Consolas" w:hAnsi="Consolas" w:eastAsia="Consolas" w:cs="Consolas"/>
+          <w:sz w:val="15"/>
+          <w:noProof/>
+        </w:rPr>
+        <w:t xml:space="preserve">    ('fingerprint', 1, 'peak', 1157, 1181, '{p}', 'Proteins', True),      # 1169</w:t>
+      </w:r>
+    </w:p>
+    <w:p>
+      <w:pPr>
+        <w:spacing w:before="0" w:after="0" w:line="240" w:lineRule="auto"/>
+      </w:pPr>
+      <w:r>
+        <w:rPr>
+          <w:rFonts w:ascii="Consolas" w:hAnsi="Consolas" w:eastAsia="Consolas" w:cs="Consolas"/>
+          <w:sz w:val="15"/>
+          <w:noProof/>
+        </w:rPr>
+        <w:t xml:space="preserve">    ('fingerprint', 1, 'peak', 1233, 1257, '{p}', 'Proteins', True),      # 1244</w:t>
+      </w:r>
+    </w:p>
+    <w:p>
+      <w:pPr>
+        <w:spacing w:before="0" w:after="0" w:line="240" w:lineRule="auto"/>
+      </w:pPr>
+      <w:r>
+        <w:rPr>
+          <w:rFonts w:ascii="Consolas" w:hAnsi="Consolas" w:eastAsia="Consolas" w:cs="Consolas"/>
+          <w:sz w:val="15"/>
+          <w:noProof/>
+        </w:rPr>
+        <w:t xml:space="preserve">    ('fingerprint', 1, 'peak', 1373, 1397, '{p}', 'Lipids/NA', True),     # 1385</w:t>
+      </w:r>
+    </w:p>
+    <w:p>
+      <w:pPr>
+        <w:spacing w:before="0" w:after="0" w:line="240" w:lineRule="auto"/>
+      </w:pPr>
+      <w:r>
+        <w:rPr>
+          <w:rFonts w:ascii="Consolas" w:hAnsi="Consolas" w:eastAsia="Consolas" w:cs="Consolas"/>
+          <w:sz w:val="15"/>
+          <w:noProof/>
+        </w:rPr>
+        <w:t xml:space="preserve">    ('fingerprint', 1, 'peak', 1595, 1619, '{p}', 'Proteins', True),      # 1607</w:t>
+      </w:r>
+    </w:p>
+    <w:p>
+      <w:pPr>
+        <w:spacing w:before="0" w:after="0" w:line="240" w:lineRule="auto"/>
+      </w:pPr>
+      <w:r>
+        <w:rPr>
+          <w:rFonts w:ascii="Consolas" w:hAnsi="Consolas" w:eastAsia="Consolas" w:cs="Consolas"/>
+          <w:sz w:val="15"/>
+          <w:noProof/>
+        </w:rPr>
+        <w:t xml:space="preserve">    ('fingerprint', 1, 'peak', 1717, 1741, '{p}', 'Lipids', True),        # 1728</w:t>
+      </w:r>
+    </w:p>
+    <w:p>
+      <w:pPr>
+        <w:spacing w:before="0" w:after="0" w:line="240" w:lineRule="auto"/>
+      </w:pPr>
+      <w:r>
+        <w:rPr>
+          <w:rFonts w:ascii="Consolas" w:hAnsi="Consolas" w:eastAsia="Consolas" w:cs="Consolas"/>
+          <w:sz w:val="15"/>
+          <w:noProof/>
+        </w:rPr>
+        <w:t xml:space="preserve">    # --- Fig 2b, CH region (exactly the labels of the approved figure)</w:t>
+      </w:r>
+    </w:p>
+    <w:p>
+      <w:pPr>
+        <w:spacing w:before="0" w:after="0" w:line="240" w:lineRule="auto"/>
+      </w:pPr>
+      <w:r>
+        <w:rPr>
+          <w:rFonts w:ascii="Consolas" w:hAnsi="Consolas" w:eastAsia="Consolas" w:cs="Consolas"/>
+          <w:sz w:val="15"/>
+          <w:noProof/>
+        </w:rPr>
+        <w:t xml:space="preserve">    ('ch', 0, 'shoulder', 2868, 2892, '{p}', 'Lipids', True),             # 2874</w:t>
+      </w:r>
+    </w:p>
+    <w:p>
+      <w:pPr>
+        <w:spacing w:before="0" w:after="0" w:line="240" w:lineRule="auto"/>
+      </w:pPr>
+      <w:r>
+        <w:rPr>
+          <w:rFonts w:ascii="Consolas" w:hAnsi="Consolas" w:eastAsia="Consolas" w:cs="Consolas"/>
+          <w:sz w:val="15"/>
+          <w:noProof/>
+        </w:rPr>
+        <w:t xml:space="preserve">    ('ch', 1, 'shoulder', 2868, 2892, '{p}', 'Lipids', True),             # 2883</w:t>
+      </w:r>
+    </w:p>
+    <w:p>
+      <w:pPr>
+        <w:spacing w:before="0" w:after="0" w:line="240" w:lineRule="auto"/>
+      </w:pPr>
+      <w:r>
+        <w:rPr>
+          <w:rFonts w:ascii="Consolas" w:hAnsi="Consolas" w:eastAsia="Consolas" w:cs="Consolas"/>
+          <w:sz w:val="15"/>
+          <w:noProof/>
+        </w:rPr>
+        <w:t xml:space="preserve">    ('ch', 0, 'peak', 2923, 2947, '{p}', 'Proteins', True),               # 2933</w:t>
+      </w:r>
+    </w:p>
+    <w:p>
+      <w:pPr>
+        <w:spacing w:before="0" w:after="0" w:line="240" w:lineRule="auto"/>
+      </w:pPr>
+      <w:r>
+        <w:rPr>
+          <w:rFonts w:ascii="Consolas" w:hAnsi="Consolas" w:eastAsia="Consolas" w:cs="Consolas"/>
+          <w:sz w:val="15"/>
+          <w:noProof/>
+        </w:rPr>
+        <w:t xml:space="preserve">    ('ch', 1, 'peak', 2923, 2947, '{p}', 'Proteins', True),               # 2937</w:t>
       </w:r>
     </w:p>
     <w:p>
@@ -3112,6 +2982,160 @@
           <w:sz w:val="15"/>
           <w:noProof/>
         </w:rPr>
+        <w:t>def shift_position(g, s, lo, hi, kind):</w:t>
+      </w:r>
+    </w:p>
+    <w:p>
+      <w:pPr>
+        <w:spacing w:before="0" w:after="0" w:line="240" w:lineRule="auto"/>
+      </w:pPr>
+      <w:r>
+        <w:rPr>
+          <w:rFonts w:ascii="Consolas" w:hAnsi="Consolas" w:eastAsia="Consolas" w:cs="Consolas"/>
+          <w:sz w:val="15"/>
+          <w:noProof/>
+        </w:rPr>
+        <w:t xml:space="preserve">    """Band position used for the grey shift shadows (same method as Table S4):</w:t>
+      </w:r>
+    </w:p>
+    <w:p>
+      <w:pPr>
+        <w:spacing w:before="0" w:after="0" w:line="240" w:lineRule="auto"/>
+      </w:pPr>
+      <w:r>
+        <w:rPr>
+          <w:rFonts w:ascii="Consolas" w:hAnsi="Consolas" w:eastAsia="Consolas" w:cs="Consolas"/>
+          <w:sz w:val="15"/>
+          <w:noProof/>
+        </w:rPr>
+        <w:t xml:space="preserve">    peak = maximum in the window, refined by a parabola (also valid at the window</w:t>
+      </w:r>
+    </w:p>
+    <w:p>
+      <w:pPr>
+        <w:spacing w:before="0" w:after="0" w:line="240" w:lineRule="auto"/>
+      </w:pPr>
+      <w:r>
+        <w:rPr>
+          <w:rFonts w:ascii="Consolas" w:hAnsi="Consolas" w:eastAsia="Consolas" w:cs="Consolas"/>
+          <w:sz w:val="15"/>
+          <w:noProof/>
+        </w:rPr>
+        <w:t xml:space="preserve">    edge); shoulder = 2nd-derivative minimum."""</w:t>
+      </w:r>
+    </w:p>
+    <w:p>
+      <w:pPr>
+        <w:spacing w:before="0" w:after="0" w:line="240" w:lineRule="auto"/>
+      </w:pPr>
+      <w:r>
+        <w:rPr>
+          <w:rFonts w:ascii="Consolas" w:hAnsi="Consolas" w:eastAsia="Consolas" w:cs="Consolas"/>
+          <w:sz w:val="15"/>
+          <w:noProof/>
+        </w:rPr>
+        <w:t xml:space="preserve">    if kind == 'shoulder':</w:t>
+      </w:r>
+    </w:p>
+    <w:p>
+      <w:pPr>
+        <w:spacing w:before="0" w:after="0" w:line="240" w:lineRule="auto"/>
+      </w:pPr>
+      <w:r>
+        <w:rPr>
+          <w:rFonts w:ascii="Consolas" w:hAnsi="Consolas" w:eastAsia="Consolas" w:cs="Consolas"/>
+          <w:sz w:val="15"/>
+          <w:noProof/>
+        </w:rPr>
+        <w:t xml:space="preserve">        return band_position(g, s, lo, hi, kind)</w:t>
+      </w:r>
+    </w:p>
+    <w:p>
+      <w:pPr>
+        <w:spacing w:before="0" w:after="0" w:line="240" w:lineRule="auto"/>
+      </w:pPr>
+      <w:r>
+        <w:rPr>
+          <w:rFonts w:ascii="Consolas" w:hAnsi="Consolas" w:eastAsia="Consolas" w:cs="Consolas"/>
+          <w:sz w:val="15"/>
+          <w:noProof/>
+        </w:rPr>
+        <w:t xml:space="preserve">    m = np.flatnonzero((g &gt;= lo) &amp; (g &lt;= hi))</w:t>
+      </w:r>
+    </w:p>
+    <w:p>
+      <w:pPr>
+        <w:spacing w:before="0" w:after="0" w:line="240" w:lineRule="auto"/>
+      </w:pPr>
+      <w:r>
+        <w:rPr>
+          <w:rFonts w:ascii="Consolas" w:hAnsi="Consolas" w:eastAsia="Consolas" w:cs="Consolas"/>
+          <w:sz w:val="15"/>
+          <w:noProof/>
+        </w:rPr>
+        <w:t xml:space="preserve">    i = m[int(np.argmax(s[m]))]</w:t>
+      </w:r>
+    </w:p>
+    <w:p>
+      <w:pPr>
+        <w:spacing w:before="0" w:after="0" w:line="240" w:lineRule="auto"/>
+      </w:pPr>
+      <w:r>
+        <w:rPr>
+          <w:rFonts w:ascii="Consolas" w:hAnsi="Consolas" w:eastAsia="Consolas" w:cs="Consolas"/>
+          <w:sz w:val="15"/>
+          <w:noProof/>
+        </w:rPr>
+        <w:t xml:space="preserve">    a, b, c = s[i - 1], s[i], s[i + 1]</w:t>
+      </w:r>
+    </w:p>
+    <w:p>
+      <w:pPr>
+        <w:spacing w:before="0" w:after="0" w:line="240" w:lineRule="auto"/>
+      </w:pPr>
+      <w:r>
+        <w:rPr>
+          <w:rFonts w:ascii="Consolas" w:hAnsi="Consolas" w:eastAsia="Consolas" w:cs="Consolas"/>
+          <w:sz w:val="15"/>
+          <w:noProof/>
+        </w:rPr>
+        <w:t xml:space="preserve">    return g[i] + 0.5 * (a - c) / (a - 2 * b + c) * (g[1] - g[0])</w:t>
+      </w:r>
+    </w:p>
+    <w:p>
+      <w:pPr>
+        <w:spacing w:before="0" w:after="0" w:line="240" w:lineRule="auto"/>
+      </w:pPr>
+      <w:r>
+        <w:rPr>
+          <w:rFonts w:ascii="Consolas" w:hAnsi="Consolas" w:eastAsia="Consolas" w:cs="Consolas"/>
+          <w:sz w:val="15"/>
+          <w:noProof/>
+        </w:rPr>
+      </w:r>
+    </w:p>
+    <w:p>
+      <w:pPr>
+        <w:spacing w:before="0" w:after="0" w:line="240" w:lineRule="auto"/>
+      </w:pPr>
+      <w:r>
+        <w:rPr>
+          <w:rFonts w:ascii="Consolas" w:hAnsi="Consolas" w:eastAsia="Consolas" w:cs="Consolas"/>
+          <w:sz w:val="15"/>
+          <w:noProof/>
+        </w:rPr>
+      </w:r>
+    </w:p>
+    <w:p>
+      <w:pPr>
+        <w:spacing w:before="0" w:after="0" w:line="240" w:lineRule="auto"/>
+      </w:pPr>
+      <w:r>
+        <w:rPr>
+          <w:rFonts w:ascii="Consolas" w:hAnsi="Consolas" w:eastAsia="Consolas" w:cs="Consolas"/>
+          <w:sz w:val="15"/>
+          <w:noProof/>
+        </w:rPr>
         <w:t>def site_positions(region, c, lo, hi, kind):</w:t>
       </w:r>
     </w:p>
@@ -3125,7 +3149,7 @@
           <w:sz w:val="15"/>
           <w:noProof/>
         </w:rPr>
-        <w:t xml:space="preserve">    return [band_position(grids[region], data[region][sites == f'{GROUPS[c]}-{k}'].mean(0), lo, hi, kind)</w:t>
+        <w:t xml:space="preserve">    return [shift_position(grids[region], data[region][sites == f'{GROUPS[c]}-{k}'].mean(0), lo, hi, kind)</w:t>
       </w:r>
     </w:p>
     <w:p>
@@ -3821,20 +3845,20 @@
           <w:sz w:val="15"/>
           <w:noProof/>
         </w:rPr>
-        <w:t xml:space="preserve">        pe = band_position(g, X[y == 0].mean(0), *ev_w, kind)</w:t>
-      </w:r>
-    </w:p>
-    <w:p>
-      <w:pPr>
-        <w:spacing w:before="0" w:after="0" w:line="240" w:lineRule="auto"/>
-      </w:pPr>
-      <w:r>
-        <w:rPr>
-          <w:rFonts w:ascii="Consolas" w:hAnsi="Consolas" w:eastAsia="Consolas" w:cs="Consolas"/>
-          <w:sz w:val="15"/>
-          <w:noProof/>
-        </w:rPr>
-        <w:t xml:space="preserve">        pn = band_position(g, X[y == 1].mean(0), *nv_w, kind)</w:t>
+        <w:t xml:space="preserve">        pe = shift_position(g, X[y == 0].mean(0), *ev_w, kind)</w:t>
+      </w:r>
+    </w:p>
+    <w:p>
+      <w:pPr>
+        <w:spacing w:before="0" w:after="0" w:line="240" w:lineRule="auto"/>
+      </w:pPr>
+      <w:r>
+        <w:rPr>
+          <w:rFonts w:ascii="Consolas" w:hAnsi="Consolas" w:eastAsia="Consolas" w:cs="Consolas"/>
+          <w:sz w:val="15"/>
+          <w:noProof/>
+        </w:rPr>
+        <w:t xml:space="preserve">        pn = shift_position(g, X[y == 1].mean(0), *nv_w, kind)</w:t>
       </w:r>
     </w:p>
     <w:p>

</xml_diff>

<commit_message>
Fig 2 code: switches for the CH2 shoulder labels and for further peaks (639, 669, 769, 1072/1075, 1288)
Co-Authored-By: Claude Opus 5.5 <noreply@anthropic.com>
Claude-Session: https://claude.ai/code/session_01L8hQ8e5u5KmaH4dD9snyRw
</commit_message>
<xml_diff>
--- a/Acacia_Fig2_MeanSD_Code.docx
+++ b/Acacia_Fig2_MeanSD_Code.docx
@@ -1385,33 +1385,7 @@
           <w:sz w:val="15"/>
           <w:noProof/>
         </w:rPr>
-        <w:t xml:space="preserve">    # --- Fig 2b, CH region (exactly the labels of the approved figure)</w:t>
-      </w:r>
-    </w:p>
-    <w:p>
-      <w:pPr>
-        <w:spacing w:before="0" w:after="0" w:line="240" w:lineRule="auto"/>
-      </w:pPr>
-      <w:r>
-        <w:rPr>
-          <w:rFonts w:ascii="Consolas" w:hAnsi="Consolas" w:eastAsia="Consolas" w:cs="Consolas"/>
-          <w:sz w:val="15"/>
-          <w:noProof/>
-        </w:rPr>
-        <w:t xml:space="preserve">    ('ch', 0, 'shoulder', 2868, 2892, '{p}', 'Lipids', True),             # 2874</w:t>
-      </w:r>
-    </w:p>
-    <w:p>
-      <w:pPr>
-        <w:spacing w:before="0" w:after="0" w:line="240" w:lineRule="auto"/>
-      </w:pPr>
-      <w:r>
-        <w:rPr>
-          <w:rFonts w:ascii="Consolas" w:hAnsi="Consolas" w:eastAsia="Consolas" w:cs="Consolas"/>
-          <w:sz w:val="15"/>
-          <w:noProof/>
-        </w:rPr>
-        <w:t xml:space="preserve">    ('ch', 1, 'shoulder', 2868, 2892, '{p}', 'Lipids', True),             # 2883</w:t>
+        <w:t xml:space="preserve">    # --- Fig 2b, CH region: main CH3 band</w:t>
       </w:r>
     </w:p>
     <w:p>
@@ -1463,6 +1437,175 @@
           <w:sz w:val="15"/>
           <w:noProof/>
         </w:rPr>
+        <w:t># ON/OFF SWITCHES for optional labels (True = label shown, False = not shown)</w:t>
+      </w:r>
+    </w:p>
+    <w:p>
+      <w:pPr>
+        <w:spacing w:before="0" w:after="0" w:line="240" w:lineRule="auto"/>
+      </w:pPr>
+      <w:r>
+        <w:rPr>
+          <w:rFonts w:ascii="Consolas" w:hAnsi="Consolas" w:eastAsia="Consolas" w:cs="Consolas"/>
+          <w:sz w:val="15"/>
+          <w:noProof/>
+        </w:rPr>
+        <w:t>SHOW_CH_SHOULDERS = True     # Fig 2b: CH2 lipid shoulder, EV 2874 / NV 2883 (+ grey shadow)</w:t>
+      </w:r>
+    </w:p>
+    <w:p>
+      <w:pPr>
+        <w:spacing w:before="0" w:after="0" w:line="240" w:lineRule="auto"/>
+      </w:pPr>
+      <w:r>
+        <w:rPr>
+          <w:rFonts w:ascii="Consolas" w:hAnsi="Consolas" w:eastAsia="Consolas" w:cs="Consolas"/>
+          <w:sz w:val="15"/>
+          <w:noProof/>
+        </w:rPr>
+        <w:t>SHOW_EXTRA_PEAKS = False     # Fig 2a: further peaks present in the mean spectra at all sites</w:t>
+      </w:r>
+    </w:p>
+    <w:p>
+      <w:pPr>
+        <w:spacing w:before="0" w:after="0" w:line="240" w:lineRule="auto"/>
+      </w:pPr>
+      <w:r>
+        <w:rPr>
+          <w:rFonts w:ascii="Consolas" w:hAnsi="Consolas" w:eastAsia="Consolas" w:cs="Consolas"/>
+          <w:sz w:val="15"/>
+          <w:noProof/>
+        </w:rPr>
+        <w:t>if SHOW_CH_SHOULDERS:</w:t>
+      </w:r>
+    </w:p>
+    <w:p>
+      <w:pPr>
+        <w:spacing w:before="0" w:after="0" w:line="240" w:lineRule="auto"/>
+      </w:pPr>
+      <w:r>
+        <w:rPr>
+          <w:rFonts w:ascii="Consolas" w:hAnsi="Consolas" w:eastAsia="Consolas" w:cs="Consolas"/>
+          <w:sz w:val="15"/>
+          <w:noProof/>
+        </w:rPr>
+        <w:t xml:space="preserve">    LABELS += [('ch', 0, 'shoulder', 2868, 2892, '{p}', 'Lipids', True),    # 2874</w:t>
+      </w:r>
+    </w:p>
+    <w:p>
+      <w:pPr>
+        <w:spacing w:before="0" w:after="0" w:line="240" w:lineRule="auto"/>
+      </w:pPr>
+      <w:r>
+        <w:rPr>
+          <w:rFonts w:ascii="Consolas" w:hAnsi="Consolas" w:eastAsia="Consolas" w:cs="Consolas"/>
+          <w:sz w:val="15"/>
+          <w:noProof/>
+        </w:rPr>
+        <w:t xml:space="preserve">               ('ch', 1, 'shoulder', 2868, 2892, '{p}', 'Lipids', True)]    # 2883</w:t>
+      </w:r>
+    </w:p>
+    <w:p>
+      <w:pPr>
+        <w:spacing w:before="0" w:after="0" w:line="240" w:lineRule="auto"/>
+      </w:pPr>
+      <w:r>
+        <w:rPr>
+          <w:rFonts w:ascii="Consolas" w:hAnsi="Consolas" w:eastAsia="Consolas" w:cs="Consolas"/>
+          <w:sz w:val="15"/>
+          <w:noProof/>
+        </w:rPr>
+        <w:t>if SHOW_EXTRA_PEAKS:</w:t>
+      </w:r>
+    </w:p>
+    <w:p>
+      <w:pPr>
+        <w:spacing w:before="0" w:after="0" w:line="240" w:lineRule="auto"/>
+      </w:pPr>
+      <w:r>
+        <w:rPr>
+          <w:rFonts w:ascii="Consolas" w:hAnsi="Consolas" w:eastAsia="Consolas" w:cs="Consolas"/>
+          <w:sz w:val="15"/>
+          <w:noProof/>
+        </w:rPr>
+        <w:t xml:space="preserve">    LABELS += [('fingerprint', 0, 'peak', 627, 651, '{p}', 'Proteins', True),        # 639 Tyr</w:t>
+      </w:r>
+    </w:p>
+    <w:p>
+      <w:pPr>
+        <w:spacing w:before="0" w:after="0" w:line="240" w:lineRule="auto"/>
+      </w:pPr>
+      <w:r>
+        <w:rPr>
+          <w:rFonts w:ascii="Consolas" w:hAnsi="Consolas" w:eastAsia="Consolas" w:cs="Consolas"/>
+          <w:sz w:val="15"/>
+          <w:noProof/>
+        </w:rPr>
+        <w:t xml:space="preserve">               ('fingerprint', 0, 'peak', 757, 781, '{p}', 'Nucleic Acids', True),   # 769</w:t>
+      </w:r>
+    </w:p>
+    <w:p>
+      <w:pPr>
+        <w:spacing w:before="0" w:after="0" w:line="240" w:lineRule="auto"/>
+      </w:pPr>
+      <w:r>
+        <w:rPr>
+          <w:rFonts w:ascii="Consolas" w:hAnsi="Consolas" w:eastAsia="Consolas" w:cs="Consolas"/>
+          <w:sz w:val="15"/>
+          <w:noProof/>
+        </w:rPr>
+        <w:t xml:space="preserve">               ('fingerprint', 0, 'peak', 1061, 1085, '{p}', 'Lipids', True),        # 1073 C-C / C-O</w:t>
+      </w:r>
+    </w:p>
+    <w:p>
+      <w:pPr>
+        <w:spacing w:before="0" w:after="0" w:line="240" w:lineRule="auto"/>
+      </w:pPr>
+      <w:r>
+        <w:rPr>
+          <w:rFonts w:ascii="Consolas" w:hAnsi="Consolas" w:eastAsia="Consolas" w:cs="Consolas"/>
+          <w:sz w:val="15"/>
+          <w:noProof/>
+        </w:rPr>
+        <w:t xml:space="preserve">               ('fingerprint', 1, 'peak', 655, 679, '{p}', 'Nucleic Acids', True),   # 667 G/T ring</w:t>
+      </w:r>
+    </w:p>
+    <w:p>
+      <w:pPr>
+        <w:spacing w:before="0" w:after="0" w:line="240" w:lineRule="auto"/>
+      </w:pPr>
+      <w:r>
+        <w:rPr>
+          <w:rFonts w:ascii="Consolas" w:hAnsi="Consolas" w:eastAsia="Consolas" w:cs="Consolas"/>
+          <w:sz w:val="15"/>
+          <w:noProof/>
+        </w:rPr>
+        <w:t xml:space="preserve">               ('fingerprint', 1, 'peak', 1063, 1087, '{p}', 'Lipids', True),        # 1075 C-C / C-O</w:t>
+      </w:r>
+    </w:p>
+    <w:p>
+      <w:pPr>
+        <w:spacing w:before="0" w:after="0" w:line="240" w:lineRule="auto"/>
+      </w:pPr>
+      <w:r>
+        <w:rPr>
+          <w:rFonts w:ascii="Consolas" w:hAnsi="Consolas" w:eastAsia="Consolas" w:cs="Consolas"/>
+          <w:sz w:val="15"/>
+          <w:noProof/>
+        </w:rPr>
+        <w:t xml:space="preserve">               ('fingerprint', 1, 'peak', 1275, 1299, '{p}', 'Proteins', True)]      # 1287 amide III</w:t>
+      </w:r>
+    </w:p>
+    <w:p>
+      <w:pPr>
+        <w:spacing w:before="0" w:after="0" w:line="240" w:lineRule="auto"/>
+      </w:pPr>
+      <w:r>
+        <w:rPr>
+          <w:rFonts w:ascii="Consolas" w:hAnsi="Consolas" w:eastAsia="Consolas" w:cs="Consolas"/>
+          <w:sz w:val="15"/>
+          <w:noProof/>
+        </w:rPr>
         <w:t># grey shadows: bands compared between EVs and NVs (EV window, NV window, kind);</w:t>
       </w:r>
     </w:p>
@@ -1541,7 +1684,33 @@
           <w:sz w:val="15"/>
           <w:noProof/>
         </w:rPr>
-        <w:t xml:space="preserve">          'ch': [((2868, 2892), (2868, 2892), 'shoulder'), ((2923, 2947), (2923, 2947), 'peak')]}</w:t>
+        <w:t xml:space="preserve">          'ch': [((2923, 2947), (2923, 2947), 'peak')]}</w:t>
+      </w:r>
+    </w:p>
+    <w:p>
+      <w:pPr>
+        <w:spacing w:before="0" w:after="0" w:line="240" w:lineRule="auto"/>
+      </w:pPr>
+      <w:r>
+        <w:rPr>
+          <w:rFonts w:ascii="Consolas" w:hAnsi="Consolas" w:eastAsia="Consolas" w:cs="Consolas"/>
+          <w:sz w:val="15"/>
+          <w:noProof/>
+        </w:rPr>
+        <w:t>if SHOW_CH_SHOULDERS:</w:t>
+      </w:r>
+    </w:p>
+    <w:p>
+      <w:pPr>
+        <w:spacing w:before="0" w:after="0" w:line="240" w:lineRule="auto"/>
+      </w:pPr>
+      <w:r>
+        <w:rPr>
+          <w:rFonts w:ascii="Consolas" w:hAnsi="Consolas" w:eastAsia="Consolas" w:cs="Consolas"/>
+          <w:sz w:val="15"/>
+          <w:noProof/>
+        </w:rPr>
+        <w:t xml:space="preserve">    SHIFTS['ch'].insert(0, ((2868, 2892), (2868, 2892), 'shoulder'))</w:t>
       </w:r>
     </w:p>
     <w:p>

</xml_diff>

<commit_message>
Fig 2a/2b: example size and fonts (2a 8.5 x 6.5 in, 2b 6.5 x 6.0 in; labels 10, axes 13, ticks 10 pt)
Co-Authored-By: Claude Opus 5.5 <noreply@anthropic.com>
Claude-Session: https://claude.ai/code/session_01L8hQ8e5u5KmaH4dD9snyRw
</commit_message>
<xml_diff>
--- a/Acacia_Fig2_MeanSD_Code.docx
+++ b/Acacia_Fig2_MeanSD_Code.docx
@@ -7,7 +7,7 @@
         <w:pStyle w:val="Heading1"/>
       </w:pPr>
       <w:r>
-        <w:t>Acacia EVs vs NVs - Figure 2a and 2b, mean +/- SD spectra with data-derived band labels</w:t>
+        <w:t>Acacia EVs vs NVs - CaF2 vs Ag/SiNWs - SERS enhancement figure (EV and NV)</w:t>
       </w:r>
     </w:p>
     <w:p>
@@ -23,7 +23,7 @@
         <w:spacing w:after="40"/>
       </w:pPr>
       <w:r>
-        <w:t>1. In PyCharm: File &gt; New &gt; Python File, name it Acacia_Fig2_MeanSD.py.</w:t>
+        <w:t>1. In PyCharm: File &gt; New &gt; Python File, name it CaF2_vs_AgSiNW_Enhancement.py.</w:t>
       </w:r>
     </w:p>
     <w:p>
@@ -39,7 +39,7 @@
         <w:spacing w:after="40"/>
       </w:pPr>
       <w:r>
-        <w:t>3. In the PyCharm Terminal, install the packages once:  pip install numpy scipy pandas openpyxl matplotlib</w:t>
+        <w:t>3. In the PyCharm Terminal, install the packages once:  pip install numpy scipy matplotlib</w:t>
       </w:r>
     </w:p>
     <w:p>
@@ -47,7 +47,15 @@
         <w:spacing w:after="40"/>
       </w:pPr>
       <w:r>
-        <w:t>4. Run the file. Data are read from C:\Users\Hira Aman\Downloads\CODE 005 and the label table is printed in the Run window. Fig2a_MeanSD_Fingerprint and Fig2b_MeanSD_CH (PNG + TIFF, 600 dpi) and Fig2_label_positions.csv are saved in CODE 005\PAPER. If you also run Acacia_Paper_All.py, run this file afterwards: both write Fig2a/Fig2b to the PAPER folder.</w:t>
+        <w:t>4. Put the four raw .txt files (EV and NV, on CaF2 and on Ag/SiNWs, original names) in C:\Users\Hira Aman\Downloads\comparison ev nv.</w:t>
+      </w:r>
+    </w:p>
+    <w:p>
+      <w:pPr>
+        <w:spacing w:after="40"/>
+      </w:pPr>
+      <w:r>
+        <w:t>5. Run the file. The band table (signal/noise on Ag/SiNWs and on CaF2) is printed; CaF2_vs_AgSiNW_Enhancement (two panels) and CaF2_vs_AgSiNW_OneGraph (all four spectra in one graph), PNG + TIFF at 600 dpi, and CaF2_vs_AgSiNW_bands.csv are saved in the same folder.</w:t>
       </w:r>
     </w:p>
     <w:p>
@@ -156,20 +164,33 @@
           <w:sz w:val="15"/>
           <w:noProof/>
         </w:rPr>
-        <w:t># Same data, pre-processing and colours as Acacia_Paper_All.py; larger fonts, lines</w:t>
-      </w:r>
-    </w:p>
-    <w:p>
-      <w:pPr>
-        <w:spacing w:before="0" w:after="0" w:line="240" w:lineRule="auto"/>
-      </w:pPr>
-      <w:r>
-        <w:rPr>
-          <w:rFonts w:ascii="Consolas" w:hAnsi="Consolas" w:eastAsia="Consolas" w:cs="Consolas"/>
-          <w:sz w:val="15"/>
-          <w:noProof/>
-        </w:rPr>
-        <w:t># and offsets for print, and the band labels listed in LABELS below.</w:t>
+        <w:t># Same data, pre-processing and colours as Acacia_Paper_All.py; figure sizes</w:t>
+      </w:r>
+    </w:p>
+    <w:p>
+      <w:pPr>
+        <w:spacing w:before="0" w:after="0" w:line="240" w:lineRule="auto"/>
+      </w:pPr>
+      <w:r>
+        <w:rPr>
+          <w:rFonts w:ascii="Consolas" w:hAnsi="Consolas" w:eastAsia="Consolas" w:cs="Consolas"/>
+          <w:sz w:val="15"/>
+          <w:noProof/>
+        </w:rPr>
+        <w:t># (2a 8.5 x 6.5 in, 2b 6.5 x 6.0 in) and fonts (labels 10, axes 13, ticks 10 pt)</w:t>
+      </w:r>
+    </w:p>
+    <w:p>
+      <w:pPr>
+        <w:spacing w:before="0" w:after="0" w:line="240" w:lineRule="auto"/>
+      </w:pPr>
+      <w:r>
+        <w:rPr>
+          <w:rFonts w:ascii="Consolas" w:hAnsi="Consolas" w:eastAsia="Consolas" w:cs="Consolas"/>
+          <w:sz w:val="15"/>
+          <w:noProof/>
+        </w:rPr>
+        <w:t># as in the CaF2 vs Ag/SiNW figure, and the band labels listed in LABELS below.</w:t>
       </w:r>
     </w:p>
     <w:p>
@@ -802,59 +823,46 @@
           <w:sz w:val="15"/>
           <w:noProof/>
         </w:rPr>
-        <w:t>OFFSET = {'fingerprint': 12.0, 'ch': 6.5}      # SNV units added to the NV spectrum</w:t>
-      </w:r>
-    </w:p>
-    <w:p>
-      <w:pPr>
-        <w:spacing w:before="0" w:after="0" w:line="240" w:lineRule="auto"/>
-      </w:pPr>
-      <w:r>
-        <w:rPr>
-          <w:rFonts w:ascii="Consolas" w:hAnsi="Consolas" w:eastAsia="Consolas" w:cs="Consolas"/>
-          <w:sz w:val="15"/>
-          <w:noProof/>
-        </w:rPr>
-        <w:t>TOP_ROOM = {'fingerprint': 7.0, 'ch': 6.0}     # space above the NV spectrum for labels</w:t>
-      </w:r>
-    </w:p>
-    <w:p>
-      <w:pPr>
-        <w:spacing w:before="0" w:after="0" w:line="240" w:lineRule="auto"/>
-      </w:pPr>
-      <w:r>
-        <w:rPr>
-          <w:rFonts w:ascii="Consolas" w:hAnsi="Consolas" w:eastAsia="Consolas" w:cs="Consolas"/>
-          <w:sz w:val="15"/>
-          <w:noProof/>
-        </w:rPr>
-        <w:t># font sizes (pt), chosen to stay readable when the figure is reduced to one</w:t>
-      </w:r>
-    </w:p>
-    <w:p>
-      <w:pPr>
-        <w:spacing w:before="0" w:after="0" w:line="240" w:lineRule="auto"/>
-      </w:pPr>
-      <w:r>
-        <w:rPr>
-          <w:rFonts w:ascii="Consolas" w:hAnsi="Consolas" w:eastAsia="Consolas" w:cs="Consolas"/>
-          <w:sz w:val="15"/>
-          <w:noProof/>
-        </w:rPr>
-        <w:t># journal column</w:t>
-      </w:r>
-    </w:p>
-    <w:p>
-      <w:pPr>
-        <w:spacing w:before="0" w:after="0" w:line="240" w:lineRule="auto"/>
-      </w:pPr>
-      <w:r>
-        <w:rPr>
-          <w:rFonts w:ascii="Consolas" w:hAnsi="Consolas" w:eastAsia="Consolas" w:cs="Consolas"/>
-          <w:sz w:val="15"/>
-          <w:noProof/>
-        </w:rPr>
-        <w:t>LABEL_FS, AXIS_FS, TICK_FS = 13, 17, 15</w:t>
+        <w:t>OFFSET = {'fingerprint': 8.5, 'ch': 5.5}       # SNV units added to the NV spectrum</w:t>
+      </w:r>
+    </w:p>
+    <w:p>
+      <w:pPr>
+        <w:spacing w:before="0" w:after="0" w:line="240" w:lineRule="auto"/>
+      </w:pPr>
+      <w:r>
+        <w:rPr>
+          <w:rFonts w:ascii="Consolas" w:hAnsi="Consolas" w:eastAsia="Consolas" w:cs="Consolas"/>
+          <w:sz w:val="15"/>
+          <w:noProof/>
+        </w:rPr>
+        <w:t>TOP_ROOM = {'fingerprint': 4.3, 'ch': 4.4}     # space above the NV spectrum for labels</w:t>
+      </w:r>
+    </w:p>
+    <w:p>
+      <w:pPr>
+        <w:spacing w:before="0" w:after="0" w:line="240" w:lineRule="auto"/>
+      </w:pPr>
+      <w:r>
+        <w:rPr>
+          <w:rFonts w:ascii="Consolas" w:hAnsi="Consolas" w:eastAsia="Consolas" w:cs="Consolas"/>
+          <w:sz w:val="15"/>
+          <w:noProof/>
+        </w:rPr>
+        <w:t># font sizes (pt): band labels, axis titles, tick numbers</w:t>
+      </w:r>
+    </w:p>
+    <w:p>
+      <w:pPr>
+        <w:spacing w:before="0" w:after="0" w:line="240" w:lineRule="auto"/>
+      </w:pPr>
+      <w:r>
+        <w:rPr>
+          <w:rFonts w:ascii="Consolas" w:hAnsi="Consolas" w:eastAsia="Consolas" w:cs="Consolas"/>
+          <w:sz w:val="15"/>
+          <w:noProof/>
+        </w:rPr>
+        <w:t>LABEL_FS, AXIS_FS, TICK_FS = 10, 13, 10</w:t>
       </w:r>
     </w:p>
     <w:p>
@@ -4196,7 +4204,7 @@
           <w:sz w:val="15"/>
           <w:noProof/>
         </w:rPr>
-        <w:t xml:space="preserve">        ax.plot(gs, mu + o, color=COLS[c], lw=1.4,</w:t>
+        <w:t xml:space="preserve">        ax.plot(gs, mu + o, color=COLS[c], lw=1.0,</w:t>
       </w:r>
     </w:p>
     <w:p>
@@ -4261,20 +4269,20 @@
           <w:sz w:val="15"/>
           <w:noProof/>
         </w:rPr>
-        <w:t xml:space="preserve">    ax.tick_params(axis='y', direction='in', length=6, width=1.0, labelleft=False)</w:t>
-      </w:r>
-    </w:p>
-    <w:p>
-      <w:pPr>
-        <w:spacing w:before="0" w:after="0" w:line="240" w:lineRule="auto"/>
-      </w:pPr>
-      <w:r>
-        <w:rPr>
-          <w:rFonts w:ascii="Consolas" w:hAnsi="Consolas" w:eastAsia="Consolas" w:cs="Consolas"/>
-          <w:sz w:val="15"/>
-          <w:noProof/>
-        </w:rPr>
-        <w:t xml:space="preserve">    ax.tick_params(axis='x', direction='in', length=6, width=1.0, labelsize=TICK_FS)</w:t>
+        <w:t xml:space="preserve">    ax.tick_params(axis='y', direction='in', length=5, labelleft=False)</w:t>
+      </w:r>
+    </w:p>
+    <w:p>
+      <w:pPr>
+        <w:spacing w:before="0" w:after="0" w:line="240" w:lineRule="auto"/>
+      </w:pPr>
+      <w:r>
+        <w:rPr>
+          <w:rFonts w:ascii="Consolas" w:hAnsi="Consolas" w:eastAsia="Consolas" w:cs="Consolas"/>
+          <w:sz w:val="15"/>
+          <w:noProof/>
+        </w:rPr>
+        <w:t xml:space="preserve">    ax.tick_params(axis='x', direction='in', length=5, labelsize=TICK_FS)</w:t>
       </w:r>
     </w:p>
     <w:p>
@@ -5698,20 +5706,20 @@
           <w:sz w:val="15"/>
           <w:noProof/>
         </w:rPr>
-        <w:t>make_figure('fingerprint', (400, 1790), (8.5, 7.8), 13, 'Fig2a_MeanSD_Fingerprint')</w:t>
-      </w:r>
-    </w:p>
-    <w:p>
-      <w:pPr>
-        <w:spacing w:before="0" w:after="0" w:line="240" w:lineRule="auto"/>
-      </w:pPr>
-      <w:r>
-        <w:rPr>
-          <w:rFonts w:ascii="Consolas" w:hAnsi="Consolas" w:eastAsia="Consolas" w:cs="Consolas"/>
-          <w:sz w:val="15"/>
-          <w:noProof/>
-        </w:rPr>
-        <w:t>make_figure('ch', (2760, 3095), (7.0, 6.5), 12, 'Fig2b_MeanSD_CH')</w:t>
+        <w:t>make_figure('fingerprint', (400, 1790), (8.5, 6.5), 10, 'Fig2a_MeanSD_Fingerprint')</w:t>
+      </w:r>
+    </w:p>
+    <w:p>
+      <w:pPr>
+        <w:spacing w:before="0" w:after="0" w:line="240" w:lineRule="auto"/>
+      </w:pPr>
+      <w:r>
+        <w:rPr>
+          <w:rFonts w:ascii="Consolas" w:hAnsi="Consolas" w:eastAsia="Consolas" w:cs="Consolas"/>
+          <w:sz w:val="15"/>
+          <w:noProof/>
+        </w:rPr>
+        <w:t>make_figure('ch', (2760, 3095), (6.5, 6.0), 9, 'Fig2b_MeanSD_CH')</w:t>
       </w:r>
     </w:p>
     <w:p>

</xml_diff>

<commit_message>
Fig 2a/2b: functional-group band labels consistent with the text (LABEL_SET switch keeps the original labels)
Co-Authored-By: Claude Opus 5.5 <noreply@anthropic.com>
Claude-Session: https://claude.ai/code/session_01L8hQ8e5u5KmaH4dD9snyRw
</commit_message>
<xml_diff>
--- a/Acacia_Fig2_MeanSD_Code.docx
+++ b/Acacia_Fig2_MeanSD_Code.docx
@@ -823,20 +823,20 @@
           <w:sz w:val="15"/>
           <w:noProof/>
         </w:rPr>
-        <w:t>OFFSET = {'fingerprint': 8.5, 'ch': 5.5}       # SNV units added to the NV spectrum</w:t>
-      </w:r>
-    </w:p>
-    <w:p>
-      <w:pPr>
-        <w:spacing w:before="0" w:after="0" w:line="240" w:lineRule="auto"/>
-      </w:pPr>
-      <w:r>
-        <w:rPr>
-          <w:rFonts w:ascii="Consolas" w:hAnsi="Consolas" w:eastAsia="Consolas" w:cs="Consolas"/>
-          <w:sz w:val="15"/>
-          <w:noProof/>
-        </w:rPr>
-        <w:t>TOP_ROOM = {'fingerprint': 4.3, 'ch': 4.4}     # space above the NV spectrum for labels</w:t>
+        <w:t>OFFSET = {'fingerprint': 9.0, 'ch': 5.5}       # SNV units added to the NV spectrum</w:t>
+      </w:r>
+    </w:p>
+    <w:p>
+      <w:pPr>
+        <w:spacing w:before="0" w:after="0" w:line="240" w:lineRule="auto"/>
+      </w:pPr>
+      <w:r>
+        <w:rPr>
+          <w:rFonts w:ascii="Consolas" w:hAnsi="Consolas" w:eastAsia="Consolas" w:cs="Consolas"/>
+          <w:sz w:val="15"/>
+          <w:noProof/>
+        </w:rPr>
+        <w:t>TOP_ROOM = {'fingerprint': 4.8, 'ch': 4.4}     # space above the NV spectrum for labels</w:t>
       </w:r>
     </w:p>
     <w:p>
@@ -913,6 +913,19 @@
           <w:sz w:val="15"/>
           <w:noProof/>
         </w:rPr>
+        <w:t>GOLD, GREEN, GREY = '#9C6500', '#3A7D22', '#404040'</w:t>
+      </w:r>
+    </w:p>
+    <w:p>
+      <w:pPr>
+        <w:spacing w:before="0" w:after="0" w:line="240" w:lineRule="auto"/>
+      </w:pPr>
+      <w:r>
+        <w:rPr>
+          <w:rFonts w:ascii="Consolas" w:hAnsi="Consolas" w:eastAsia="Consolas" w:cs="Consolas"/>
+          <w:sz w:val="15"/>
+          <w:noProof/>
+        </w:rPr>
         <w:t>CLASS = {'Proteins': [('Proteins', PURPLE)],</w:t>
       </w:r>
     </w:p>
@@ -1004,6 +1017,136 @@
           <w:sz w:val="15"/>
           <w:noProof/>
         </w:rPr>
+        <w:t xml:space="preserve">         # functional-group labels (LABEL_SET = 'revised')</w:t>
+      </w:r>
+    </w:p>
+    <w:p>
+      <w:pPr>
+        <w:spacing w:before="0" w:after="0" w:line="240" w:lineRule="auto"/>
+      </w:pPr>
+      <w:r>
+        <w:rPr>
+          <w:rFonts w:ascii="Consolas" w:hAnsi="Consolas" w:eastAsia="Consolas" w:cs="Consolas"/>
+          <w:sz w:val="15"/>
+          <w:noProof/>
+        </w:rPr>
+        <w:t xml:space="preserve">         'Carotenoids/Phe': [('Carotenoids/', GOLD), ('Phe', PURPLE)],</w:t>
+      </w:r>
+    </w:p>
+    <w:p>
+      <w:pPr>
+        <w:spacing w:before="0" w:after="0" w:line="240" w:lineRule="auto"/>
+      </w:pPr>
+      <w:r>
+        <w:rPr>
+          <w:rFonts w:ascii="Consolas" w:hAnsi="Consolas" w:eastAsia="Consolas" w:cs="Consolas"/>
+          <w:sz w:val="15"/>
+          <w:noProof/>
+        </w:rPr>
+        <w:t xml:space="preserve">         'Carotenoids': [('Carotenoids', GOLD)],</w:t>
+      </w:r>
+    </w:p>
+    <w:p>
+      <w:pPr>
+        <w:spacing w:before="0" w:after="0" w:line="240" w:lineRule="auto"/>
+      </w:pPr>
+      <w:r>
+        <w:rPr>
+          <w:rFonts w:ascii="Consolas" w:hAnsi="Consolas" w:eastAsia="Consolas" w:cs="Consolas"/>
+          <w:sz w:val="15"/>
+          <w:noProof/>
+        </w:rPr>
+        <w:t xml:space="preserve">         'COO- (sym.)': [('COO$^{-}$ (sym.)', GREEN)],</w:t>
+      </w:r>
+    </w:p>
+    <w:p>
+      <w:pPr>
+        <w:spacing w:before="0" w:after="0" w:line="240" w:lineRule="auto"/>
+      </w:pPr>
+      <w:r>
+        <w:rPr>
+          <w:rFonts w:ascii="Consolas" w:hAnsi="Consolas" w:eastAsia="Consolas" w:cs="Consolas"/>
+          <w:sz w:val="15"/>
+          <w:noProof/>
+        </w:rPr>
+        <w:t xml:space="preserve">         'Aromatic C=C': [('Arom. C=C', PURPLE)],</w:t>
+      </w:r>
+    </w:p>
+    <w:p>
+      <w:pPr>
+        <w:spacing w:before="0" w:after="0" w:line="240" w:lineRule="auto"/>
+      </w:pPr>
+      <w:r>
+        <w:rPr>
+          <w:rFonts w:ascii="Consolas" w:hAnsi="Consolas" w:eastAsia="Consolas" w:cs="Consolas"/>
+          <w:sz w:val="15"/>
+          <w:noProof/>
+        </w:rPr>
+        <w:t xml:space="preserve">         'Amide III': [('Amide III', PURPLE)],</w:t>
+      </w:r>
+    </w:p>
+    <w:p>
+      <w:pPr>
+        <w:spacing w:before="0" w:after="0" w:line="240" w:lineRule="auto"/>
+      </w:pPr>
+      <w:r>
+        <w:rPr>
+          <w:rFonts w:ascii="Consolas" w:hAnsi="Consolas" w:eastAsia="Consolas" w:cs="Consolas"/>
+          <w:sz w:val="15"/>
+          <w:noProof/>
+        </w:rPr>
+        <w:t xml:space="preserve">         'O-P-O': [('O\u2013P\u2013O', DARKBLUE)],</w:t>
+      </w:r>
+    </w:p>
+    <w:p>
+      <w:pPr>
+        <w:spacing w:before="0" w:after="0" w:line="240" w:lineRule="auto"/>
+      </w:pPr>
+      <w:r>
+        <w:rPr>
+          <w:rFonts w:ascii="Consolas" w:hAnsi="Consolas" w:eastAsia="Consolas" w:cs="Consolas"/>
+          <w:sz w:val="15"/>
+          <w:noProof/>
+        </w:rPr>
+        <w:t xml:space="preserve">         'Ester C=O': [('Ester C=O', BLUE)],</w:t>
+      </w:r>
+    </w:p>
+    <w:p>
+      <w:pPr>
+        <w:spacing w:before="0" w:after="0" w:line="240" w:lineRule="auto"/>
+      </w:pPr>
+      <w:r>
+        <w:rPr>
+          <w:rFonts w:ascii="Consolas" w:hAnsi="Consolas" w:eastAsia="Consolas" w:cs="Consolas"/>
+          <w:sz w:val="15"/>
+          <w:noProof/>
+        </w:rPr>
+        <w:t xml:space="preserve">         'CH2 (lipids)': [('CH$_2$ (lipids)', BLUE)],</w:t>
+      </w:r>
+    </w:p>
+    <w:p>
+      <w:pPr>
+        <w:spacing w:before="0" w:after="0" w:line="240" w:lineRule="auto"/>
+      </w:pPr>
+      <w:r>
+        <w:rPr>
+          <w:rFonts w:ascii="Consolas" w:hAnsi="Consolas" w:eastAsia="Consolas" w:cs="Consolas"/>
+          <w:sz w:val="15"/>
+          <w:noProof/>
+        </w:rPr>
+        <w:t xml:space="preserve">         'CH3': [('CH$_3$', GREY)],</w:t>
+      </w:r>
+    </w:p>
+    <w:p>
+      <w:pPr>
+        <w:spacing w:before="0" w:after="0" w:line="240" w:lineRule="auto"/>
+      </w:pPr>
+      <w:r>
+        <w:rPr>
+          <w:rFonts w:ascii="Consolas" w:hAnsi="Consolas" w:eastAsia="Consolas" w:cs="Consolas"/>
+          <w:sz w:val="15"/>
+          <w:noProof/>
+        </w:rPr>
         <w:t xml:space="preserve">         None: []}</w:t>
       </w:r>
     </w:p>
@@ -1602,6 +1745,188 @@
           <w:noProof/>
         </w:rPr>
         <w:t xml:space="preserve">               ('fingerprint', 1, 'peak', 1275, 1299, '{p}', 'Proteins', True)]      # 1287 amide III</w:t>
+      </w:r>
+    </w:p>
+    <w:p>
+      <w:pPr>
+        <w:spacing w:before="0" w:after="0" w:line="240" w:lineRule="auto"/>
+      </w:pPr>
+      <w:r>
+        <w:rPr>
+          <w:rFonts w:ascii="Consolas" w:hAnsi="Consolas" w:eastAsia="Consolas" w:cs="Consolas"/>
+          <w:sz w:val="15"/>
+          <w:noProof/>
+        </w:rPr>
+        <w:t># WHICH LABEL WORDS: 'revised' = functional groups, consistent with the text and</w:t>
+      </w:r>
+    </w:p>
+    <w:p>
+      <w:pPr>
+        <w:spacing w:before="0" w:after="0" w:line="240" w:lineRule="auto"/>
+      </w:pPr>
+      <w:r>
+        <w:rPr>
+          <w:rFonts w:ascii="Consolas" w:hAnsi="Consolas" w:eastAsia="Consolas" w:cs="Consolas"/>
+          <w:sz w:val="15"/>
+          <w:noProof/>
+        </w:rPr>
+        <w:t># Table S1 (reviewer comment on band assignments); 'original' = the first version</w:t>
+      </w:r>
+    </w:p>
+    <w:p>
+      <w:pPr>
+        <w:spacing w:before="0" w:after="0" w:line="240" w:lineRule="auto"/>
+      </w:pPr>
+      <w:r>
+        <w:rPr>
+          <w:rFonts w:ascii="Consolas" w:hAnsi="Consolas" w:eastAsia="Consolas" w:cs="Consolas"/>
+          <w:sz w:val="15"/>
+          <w:noProof/>
+        </w:rPr>
+        <w:t># (Proteins / Lipids / Lipids/NA / Nucleic Acids). Positions are the same in both.</w:t>
+      </w:r>
+    </w:p>
+    <w:p>
+      <w:pPr>
+        <w:spacing w:before="0" w:after="0" w:line="240" w:lineRule="auto"/>
+      </w:pPr>
+      <w:r>
+        <w:rPr>
+          <w:rFonts w:ascii="Consolas" w:hAnsi="Consolas" w:eastAsia="Consolas" w:cs="Consolas"/>
+          <w:sz w:val="15"/>
+          <w:noProof/>
+        </w:rPr>
+        <w:t>LABEL_SET = 'revised'</w:t>
+      </w:r>
+    </w:p>
+    <w:p>
+      <w:pPr>
+        <w:spacing w:before="0" w:after="0" w:line="240" w:lineRule="auto"/>
+      </w:pPr>
+      <w:r>
+        <w:rPr>
+          <w:rFonts w:ascii="Consolas" w:hAnsi="Consolas" w:eastAsia="Consolas" w:cs="Consolas"/>
+          <w:sz w:val="15"/>
+          <w:noProof/>
+        </w:rPr>
+        <w:t>REVISED = {('fingerprint', 797): 'O-P-O', ('fingerprint', 787): 'O-P-O',            # 809 / 799</w:t>
+      </w:r>
+    </w:p>
+    <w:p>
+      <w:pPr>
+        <w:spacing w:before="0" w:after="0" w:line="240" w:lineRule="auto"/>
+      </w:pPr>
+      <w:r>
+        <w:rPr>
+          <w:rFonts w:ascii="Consolas" w:hAnsi="Consolas" w:eastAsia="Consolas" w:cs="Consolas"/>
+          <w:sz w:val="15"/>
+          <w:noProof/>
+        </w:rPr>
+        <w:t xml:space="preserve">           ('fingerprint', 989): 'Carotenoids/Phe',                                 # 1002 / 1001</w:t>
+      </w:r>
+    </w:p>
+    <w:p>
+      <w:pPr>
+        <w:spacing w:before="0" w:after="0" w:line="240" w:lineRule="auto"/>
+      </w:pPr>
+      <w:r>
+        <w:rPr>
+          <w:rFonts w:ascii="Consolas" w:hAnsi="Consolas" w:eastAsia="Consolas" w:cs="Consolas"/>
+          <w:sz w:val="15"/>
+          <w:noProof/>
+        </w:rPr>
+        <w:t xml:space="preserve">           ('fingerprint', 1149): 'Carotenoids', ('fingerprint', 1157): 'Carotenoids',  # 1162 / 1169</w:t>
+      </w:r>
+    </w:p>
+    <w:p>
+      <w:pPr>
+        <w:spacing w:before="0" w:after="0" w:line="240" w:lineRule="auto"/>
+      </w:pPr>
+      <w:r>
+        <w:rPr>
+          <w:rFonts w:ascii="Consolas" w:hAnsi="Consolas" w:eastAsia="Consolas" w:cs="Consolas"/>
+          <w:sz w:val="15"/>
+          <w:noProof/>
+        </w:rPr>
+        <w:t xml:space="preserve">           ('fingerprint', 1237): 'Amide III', ('fingerprint', 1233): 'Amide III',  # 1249 / 1244</w:t>
+      </w:r>
+    </w:p>
+    <w:p>
+      <w:pPr>
+        <w:spacing w:before="0" w:after="0" w:line="240" w:lineRule="auto"/>
+      </w:pPr>
+      <w:r>
+        <w:rPr>
+          <w:rFonts w:ascii="Consolas" w:hAnsi="Consolas" w:eastAsia="Consolas" w:cs="Consolas"/>
+          <w:sz w:val="15"/>
+          <w:noProof/>
+        </w:rPr>
+        <w:t xml:space="preserve">           ('fingerprint', 1361): 'COO- (sym.)', ('fingerprint', 1373): 'COO- (sym.)',  # 1373 / 1385</w:t>
+      </w:r>
+    </w:p>
+    <w:p>
+      <w:pPr>
+        <w:spacing w:before="0" w:after="0" w:line="240" w:lineRule="auto"/>
+      </w:pPr>
+      <w:r>
+        <w:rPr>
+          <w:rFonts w:ascii="Consolas" w:hAnsi="Consolas" w:eastAsia="Consolas" w:cs="Consolas"/>
+          <w:sz w:val="15"/>
+          <w:noProof/>
+        </w:rPr>
+        <w:t xml:space="preserve">           ('fingerprint', 1591): 'Aromatic C=C', ('fingerprint', 1595): 'Aromatic C=C',  # 1603 / 1607</w:t>
+      </w:r>
+    </w:p>
+    <w:p>
+      <w:pPr>
+        <w:spacing w:before="0" w:after="0" w:line="240" w:lineRule="auto"/>
+      </w:pPr>
+      <w:r>
+        <w:rPr>
+          <w:rFonts w:ascii="Consolas" w:hAnsi="Consolas" w:eastAsia="Consolas" w:cs="Consolas"/>
+          <w:sz w:val="15"/>
+          <w:noProof/>
+        </w:rPr>
+        <w:t xml:space="preserve">           ('fingerprint', 1717): 'Ester C=O',                                      # 1728</w:t>
+      </w:r>
+    </w:p>
+    <w:p>
+      <w:pPr>
+        <w:spacing w:before="0" w:after="0" w:line="240" w:lineRule="auto"/>
+      </w:pPr>
+      <w:r>
+        <w:rPr>
+          <w:rFonts w:ascii="Consolas" w:hAnsi="Consolas" w:eastAsia="Consolas" w:cs="Consolas"/>
+          <w:sz w:val="15"/>
+          <w:noProof/>
+        </w:rPr>
+        <w:t xml:space="preserve">           ('ch', 2923): 'CH3', ('ch', 2868): 'CH2 (lipids)'}                       # 2933/2937, 2874/2883</w:t>
+      </w:r>
+    </w:p>
+    <w:p>
+      <w:pPr>
+        <w:spacing w:before="0" w:after="0" w:line="240" w:lineRule="auto"/>
+      </w:pPr>
+      <w:r>
+        <w:rPr>
+          <w:rFonts w:ascii="Consolas" w:hAnsi="Consolas" w:eastAsia="Consolas" w:cs="Consolas"/>
+          <w:sz w:val="15"/>
+          <w:noProof/>
+        </w:rPr>
+        <w:t>if LABEL_SET == 'revised':                 # 855/829, 932/927 and 1033 keep 'Proteins'</w:t>
+      </w:r>
+    </w:p>
+    <w:p>
+      <w:pPr>
+        <w:spacing w:before="0" w:after="0" w:line="240" w:lineRule="auto"/>
+      </w:pPr>
+      <w:r>
+        <w:rPr>
+          <w:rFonts w:ascii="Consolas" w:hAnsi="Consolas" w:eastAsia="Consolas" w:cs="Consolas"/>
+          <w:sz w:val="15"/>
+          <w:noProof/>
+        </w:rPr>
+        <w:t xml:space="preserve">    LABELS = [lab[:6] + (REVISED.get((lab[0], lab[3]), lab[6]),) + lab[7:] for lab in LABELS]</w:t>
       </w:r>
     </w:p>
     <w:p>

</xml_diff>

<commit_message>
Fig 2a/2b: Acacia-based band labels (phenolics, carboxylates, polysaccharides; no carotenoids: no 1520 cm-1 band)
Co-Authored-By: Claude Opus 5.5 <noreply@anthropic.com>
Claude-Session: https://claude.ai/code/session_01L8hQ8e5u5KmaH4dD9snyRw
</commit_message>
<xml_diff>
--- a/Acacia_Fig2_MeanSD_Code.docx
+++ b/Acacia_Fig2_MeanSD_Code.docx
@@ -1147,6 +1147,97 @@
           <w:sz w:val="15"/>
           <w:noProof/>
         </w:rPr>
+        <w:t xml:space="preserve">         # Acacia labels (LABEL_SET = 'acacia')</w:t>
+      </w:r>
+    </w:p>
+    <w:p>
+      <w:pPr>
+        <w:spacing w:before="0" w:after="0" w:line="240" w:lineRule="auto"/>
+      </w:pPr>
+      <w:r>
+        <w:rPr>
+          <w:rFonts w:ascii="Consolas" w:hAnsi="Consolas" w:eastAsia="Consolas" w:cs="Consolas"/>
+          <w:sz w:val="15"/>
+          <w:noProof/>
+        </w:rPr>
+        <w:t xml:space="preserve">         'Phe': [('Phe', PURPLE)],</w:t>
+      </w:r>
+    </w:p>
+    <w:p>
+      <w:pPr>
+        <w:spacing w:before="0" w:after="0" w:line="240" w:lineRule="auto"/>
+      </w:pPr>
+      <w:r>
+        <w:rPr>
+          <w:rFonts w:ascii="Consolas" w:hAnsi="Consolas" w:eastAsia="Consolas" w:cs="Consolas"/>
+          <w:sz w:val="15"/>
+          <w:noProof/>
+        </w:rPr>
+        <w:t xml:space="preserve">         'Tyr': [('Tyr', PURPLE)],</w:t>
+      </w:r>
+    </w:p>
+    <w:p>
+      <w:pPr>
+        <w:spacing w:before="0" w:after="0" w:line="240" w:lineRule="auto"/>
+      </w:pPr>
+      <w:r>
+        <w:rPr>
+          <w:rFonts w:ascii="Consolas" w:hAnsi="Consolas" w:eastAsia="Consolas" w:cs="Consolas"/>
+          <w:sz w:val="15"/>
+          <w:noProof/>
+        </w:rPr>
+        <w:t xml:space="preserve">         'Phenolics': [('Phenolics', GOLD)],</w:t>
+      </w:r>
+    </w:p>
+    <w:p>
+      <w:pPr>
+        <w:spacing w:before="0" w:after="0" w:line="240" w:lineRule="auto"/>
+      </w:pPr>
+      <w:r>
+        <w:rPr>
+          <w:rFonts w:ascii="Consolas" w:hAnsi="Consolas" w:eastAsia="Consolas" w:cs="Consolas"/>
+          <w:sz w:val="15"/>
+          <w:noProof/>
+        </w:rPr>
+        <w:t xml:space="preserve">         'Phenolics/Tyr': [('Phenolics/', GOLD), ('Tyr', PURPLE)],</w:t>
+      </w:r>
+    </w:p>
+    <w:p>
+      <w:pPr>
+        <w:spacing w:before="0" w:after="0" w:line="240" w:lineRule="auto"/>
+      </w:pPr>
+      <w:r>
+        <w:rPr>
+          <w:rFonts w:ascii="Consolas" w:hAnsi="Consolas" w:eastAsia="Consolas" w:cs="Consolas"/>
+          <w:sz w:val="15"/>
+          <w:noProof/>
+        </w:rPr>
+        <w:t xml:space="preserve">         'Polysacch./Tyr': [('Polysacch./', GREEN), ('Tyr', PURPLE)],</w:t>
+      </w:r>
+    </w:p>
+    <w:p>
+      <w:pPr>
+        <w:spacing w:before="0" w:after="0" w:line="240" w:lineRule="auto"/>
+      </w:pPr>
+      <w:r>
+        <w:rPr>
+          <w:rFonts w:ascii="Consolas" w:hAnsi="Consolas" w:eastAsia="Consolas" w:cs="Consolas"/>
+          <w:sz w:val="15"/>
+          <w:noProof/>
+        </w:rPr>
+        <w:t xml:space="preserve">         'C-COO-': [('C\u2013COO$^{-}$', GREEN)],</w:t>
+      </w:r>
+    </w:p>
+    <w:p>
+      <w:pPr>
+        <w:spacing w:before="0" w:after="0" w:line="240" w:lineRule="auto"/>
+      </w:pPr>
+      <w:r>
+        <w:rPr>
+          <w:rFonts w:ascii="Consolas" w:hAnsi="Consolas" w:eastAsia="Consolas" w:cs="Consolas"/>
+          <w:sz w:val="15"/>
+          <w:noProof/>
+        </w:rPr>
         <w:t xml:space="preserve">         None: []}</w:t>
       </w:r>
     </w:p>
@@ -1757,46 +1848,98 @@
           <w:sz w:val="15"/>
           <w:noProof/>
         </w:rPr>
-        <w:t># WHICH LABEL WORDS: 'revised' = functional groups, consistent with the text and</w:t>
-      </w:r>
-    </w:p>
-    <w:p>
-      <w:pPr>
-        <w:spacing w:before="0" w:after="0" w:line="240" w:lineRule="auto"/>
-      </w:pPr>
-      <w:r>
-        <w:rPr>
-          <w:rFonts w:ascii="Consolas" w:hAnsi="Consolas" w:eastAsia="Consolas" w:cs="Consolas"/>
-          <w:sz w:val="15"/>
-          <w:noProof/>
-        </w:rPr>
-        <w:t># Table S1 (reviewer comment on band assignments); 'original' = the first version</w:t>
-      </w:r>
-    </w:p>
-    <w:p>
-      <w:pPr>
-        <w:spacing w:before="0" w:after="0" w:line="240" w:lineRule="auto"/>
-      </w:pPr>
-      <w:r>
-        <w:rPr>
-          <w:rFonts w:ascii="Consolas" w:hAnsi="Consolas" w:eastAsia="Consolas" w:cs="Consolas"/>
-          <w:sz w:val="15"/>
-          <w:noProof/>
-        </w:rPr>
-        <w:t># (Proteins / Lipids / Lipids/NA / Nucleic Acids). Positions are the same in both.</w:t>
-      </w:r>
-    </w:p>
-    <w:p>
-      <w:pPr>
-        <w:spacing w:before="0" w:after="0" w:line="240" w:lineRule="auto"/>
-      </w:pPr>
-      <w:r>
-        <w:rPr>
-          <w:rFonts w:ascii="Consolas" w:hAnsi="Consolas" w:eastAsia="Consolas" w:cs="Consolas"/>
-          <w:sz w:val="15"/>
-          <w:noProof/>
-        </w:rPr>
-        <w:t>LABEL_SET = 'revised'</w:t>
+        <w:t># WHICH LABEL WORDS (positions are the same in all three):</w:t>
+      </w:r>
+    </w:p>
+    <w:p>
+      <w:pPr>
+        <w:spacing w:before="0" w:after="0" w:line="240" w:lineRule="auto"/>
+      </w:pPr>
+      <w:r>
+        <w:rPr>
+          <w:rFonts w:ascii="Consolas" w:hAnsi="Consolas" w:eastAsia="Consolas" w:cs="Consolas"/>
+          <w:sz w:val="15"/>
+          <w:noProof/>
+        </w:rPr>
+        <w:t>#   'acacia'   = assignments for an Acacia flower sample: phenolics/flavonoids, uronic-acid</w:t>
+      </w:r>
+    </w:p>
+    <w:p>
+      <w:pPr>
+        <w:spacing w:before="0" w:after="0" w:line="240" w:lineRule="auto"/>
+      </w:pPr>
+      <w:r>
+        <w:rPr>
+          <w:rFonts w:ascii="Consolas" w:hAnsi="Consolas" w:eastAsia="Consolas" w:cs="Consolas"/>
+          <w:sz w:val="15"/>
+          <w:noProof/>
+        </w:rPr>
+        <w:t>#                carboxylates and cell-wall polysaccharides besides proteins and lipids;</w:t>
+      </w:r>
+    </w:p>
+    <w:p>
+      <w:pPr>
+        <w:spacing w:before="0" w:after="0" w:line="240" w:lineRule="auto"/>
+      </w:pPr>
+      <w:r>
+        <w:rPr>
+          <w:rFonts w:ascii="Consolas" w:hAnsi="Consolas" w:eastAsia="Consolas" w:cs="Consolas"/>
+          <w:sz w:val="15"/>
+          <w:noProof/>
+        </w:rPr>
+        <w:t>#                no carotenoids, because the strongest carotenoid band (~1520 cm-1) is</w:t>
+      </w:r>
+    </w:p>
+    <w:p>
+      <w:pPr>
+        <w:spacing w:before="0" w:after="0" w:line="240" w:lineRule="auto"/>
+      </w:pPr>
+      <w:r>
+        <w:rPr>
+          <w:rFonts w:ascii="Consolas" w:hAnsi="Consolas" w:eastAsia="Consolas" w:cs="Consolas"/>
+          <w:sz w:val="15"/>
+          <w:noProof/>
+        </w:rPr>
+        <w:t>#                absent at all 6 EV sites although the ~1160 cm-1 band is clear</w:t>
+      </w:r>
+    </w:p>
+    <w:p>
+      <w:pPr>
+        <w:spacing w:before="0" w:after="0" w:line="240" w:lineRule="auto"/>
+      </w:pPr>
+      <w:r>
+        <w:rPr>
+          <w:rFonts w:ascii="Consolas" w:hAnsi="Consolas" w:eastAsia="Consolas" w:cs="Consolas"/>
+          <w:sz w:val="15"/>
+          <w:noProof/>
+        </w:rPr>
+        <w:t>#   'revised'  = functional groups with carotenoids at 1001/1160 (manuscript v7 text)</w:t>
+      </w:r>
+    </w:p>
+    <w:p>
+      <w:pPr>
+        <w:spacing w:before="0" w:after="0" w:line="240" w:lineRule="auto"/>
+      </w:pPr>
+      <w:r>
+        <w:rPr>
+          <w:rFonts w:ascii="Consolas" w:hAnsi="Consolas" w:eastAsia="Consolas" w:cs="Consolas"/>
+          <w:sz w:val="15"/>
+          <w:noProof/>
+        </w:rPr>
+        <w:t>#   'original' = the first version (Proteins / Lipids / Lipids/NA / Nucleic Acids)</w:t>
+      </w:r>
+    </w:p>
+    <w:p>
+      <w:pPr>
+        <w:spacing w:before="0" w:after="0" w:line="240" w:lineRule="auto"/>
+      </w:pPr>
+      <w:r>
+        <w:rPr>
+          <w:rFonts w:ascii="Consolas" w:hAnsi="Consolas" w:eastAsia="Consolas" w:cs="Consolas"/>
+          <w:sz w:val="15"/>
+          <w:noProof/>
+        </w:rPr>
+        <w:t>LABEL_SET = 'acacia'</w:t>
       </w:r>
     </w:p>
     <w:p>
@@ -1913,20 +2056,176 @@
           <w:sz w:val="15"/>
           <w:noProof/>
         </w:rPr>
-        <w:t>if LABEL_SET == 'revised':                 # 855/829, 932/927 and 1033 keep 'Proteins'</w:t>
-      </w:r>
-    </w:p>
-    <w:p>
-      <w:pPr>
-        <w:spacing w:before="0" w:after="0" w:line="240" w:lineRule="auto"/>
-      </w:pPr>
-      <w:r>
-        <w:rPr>
-          <w:rFonts w:ascii="Consolas" w:hAnsi="Consolas" w:eastAsia="Consolas" w:cs="Consolas"/>
-          <w:sz w:val="15"/>
-          <w:noProof/>
-        </w:rPr>
-        <w:t xml:space="preserve">    LABELS = [lab[:6] + (REVISED.get((lab[0], lab[3]), lab[6]),) + lab[7:] for lab in LABELS]</w:t>
+        <w:t>ACACIA = {('fingerprint', 797): 'O-P-O', ('fingerprint', 787): 'O-P-O',           # 809 / 799</w:t>
+      </w:r>
+    </w:p>
+    <w:p>
+      <w:pPr>
+        <w:spacing w:before="0" w:after="0" w:line="240" w:lineRule="auto"/>
+      </w:pPr>
+      <w:r>
+        <w:rPr>
+          <w:rFonts w:ascii="Consolas" w:hAnsi="Consolas" w:eastAsia="Consolas" w:cs="Consolas"/>
+          <w:sz w:val="15"/>
+          <w:noProof/>
+        </w:rPr>
+        <w:t xml:space="preserve">          ('fingerprint', 843): 'Polysacch./Tyr',                                  # 855 (EV)</w:t>
+      </w:r>
+    </w:p>
+    <w:p>
+      <w:pPr>
+        <w:spacing w:before="0" w:after="0" w:line="240" w:lineRule="auto"/>
+      </w:pPr>
+      <w:r>
+        <w:rPr>
+          <w:rFonts w:ascii="Consolas" w:hAnsi="Consolas" w:eastAsia="Consolas" w:cs="Consolas"/>
+          <w:sz w:val="15"/>
+          <w:noProof/>
+        </w:rPr>
+        <w:t xml:space="preserve">          ('fingerprint', 817): 'Tyr',                                             # 829 (NV)</w:t>
+      </w:r>
+    </w:p>
+    <w:p>
+      <w:pPr>
+        <w:spacing w:before="0" w:after="0" w:line="240" w:lineRule="auto"/>
+      </w:pPr>
+      <w:r>
+        <w:rPr>
+          <w:rFonts w:ascii="Consolas" w:hAnsi="Consolas" w:eastAsia="Consolas" w:cs="Consolas"/>
+          <w:sz w:val="15"/>
+          <w:noProof/>
+        </w:rPr>
+        <w:t xml:space="preserve">          ('fingerprint', 919): 'C-COO-', ('fingerprint', 915): 'C-COO-',          # 932 / 927</w:t>
+      </w:r>
+    </w:p>
+    <w:p>
+      <w:pPr>
+        <w:spacing w:before="0" w:after="0" w:line="240" w:lineRule="auto"/>
+      </w:pPr>
+      <w:r>
+        <w:rPr>
+          <w:rFonts w:ascii="Consolas" w:hAnsi="Consolas" w:eastAsia="Consolas" w:cs="Consolas"/>
+          <w:sz w:val="15"/>
+          <w:noProof/>
+        </w:rPr>
+        <w:t xml:space="preserve">          ('fingerprint', 989): 'Phe', ('fingerprint', 1021): 'Phe',               # 1002/1001, 1033</w:t>
+      </w:r>
+    </w:p>
+    <w:p>
+      <w:pPr>
+        <w:spacing w:before="0" w:after="0" w:line="240" w:lineRule="auto"/>
+      </w:pPr>
+      <w:r>
+        <w:rPr>
+          <w:rFonts w:ascii="Consolas" w:hAnsi="Consolas" w:eastAsia="Consolas" w:cs="Consolas"/>
+          <w:sz w:val="15"/>
+          <w:noProof/>
+        </w:rPr>
+        <w:t xml:space="preserve">          ('fingerprint', 1149): 'Phenolics/Tyr', ('fingerprint', 1157): 'Phenolics/Tyr',  # 1162 / 1169</w:t>
+      </w:r>
+    </w:p>
+    <w:p>
+      <w:pPr>
+        <w:spacing w:before="0" w:after="0" w:line="240" w:lineRule="auto"/>
+      </w:pPr>
+      <w:r>
+        <w:rPr>
+          <w:rFonts w:ascii="Consolas" w:hAnsi="Consolas" w:eastAsia="Consolas" w:cs="Consolas"/>
+          <w:sz w:val="15"/>
+          <w:noProof/>
+        </w:rPr>
+        <w:t xml:space="preserve">          ('fingerprint', 1237): 'Amide III', ('fingerprint', 1233): 'Amide III',  # 1249 / 1244</w:t>
+      </w:r>
+    </w:p>
+    <w:p>
+      <w:pPr>
+        <w:spacing w:before="0" w:after="0" w:line="240" w:lineRule="auto"/>
+      </w:pPr>
+      <w:r>
+        <w:rPr>
+          <w:rFonts w:ascii="Consolas" w:hAnsi="Consolas" w:eastAsia="Consolas" w:cs="Consolas"/>
+          <w:sz w:val="15"/>
+          <w:noProof/>
+        </w:rPr>
+        <w:t xml:space="preserve">          ('fingerprint', 1361): 'COO- (sym.)', ('fingerprint', 1373): 'COO- (sym.)',  # 1373 / 1385</w:t>
+      </w:r>
+    </w:p>
+    <w:p>
+      <w:pPr>
+        <w:spacing w:before="0" w:after="0" w:line="240" w:lineRule="auto"/>
+      </w:pPr>
+      <w:r>
+        <w:rPr>
+          <w:rFonts w:ascii="Consolas" w:hAnsi="Consolas" w:eastAsia="Consolas" w:cs="Consolas"/>
+          <w:sz w:val="15"/>
+          <w:noProof/>
+        </w:rPr>
+        <w:t xml:space="preserve">          ('fingerprint', 1591): 'Phenolics', ('fingerprint', 1595): 'Phenolics',  # 1603 / 1607 (minor Phe)</w:t>
+      </w:r>
+    </w:p>
+    <w:p>
+      <w:pPr>
+        <w:spacing w:before="0" w:after="0" w:line="240" w:lineRule="auto"/>
+      </w:pPr>
+      <w:r>
+        <w:rPr>
+          <w:rFonts w:ascii="Consolas" w:hAnsi="Consolas" w:eastAsia="Consolas" w:cs="Consolas"/>
+          <w:sz w:val="15"/>
+          <w:noProof/>
+        </w:rPr>
+        <w:t xml:space="preserve">          ('fingerprint', 1717): 'Ester C=O',                                      # 1728</w:t>
+      </w:r>
+    </w:p>
+    <w:p>
+      <w:pPr>
+        <w:spacing w:before="0" w:after="0" w:line="240" w:lineRule="auto"/>
+      </w:pPr>
+      <w:r>
+        <w:rPr>
+          <w:rFonts w:ascii="Consolas" w:hAnsi="Consolas" w:eastAsia="Consolas" w:cs="Consolas"/>
+          <w:sz w:val="15"/>
+          <w:noProof/>
+        </w:rPr>
+        <w:t xml:space="preserve">          ('ch', 2923): 'CH3', ('ch', 2868): 'CH2 (lipids)'}                       # 2933/2937, 2874/2883</w:t>
+      </w:r>
+    </w:p>
+    <w:p>
+      <w:pPr>
+        <w:spacing w:before="0" w:after="0" w:line="240" w:lineRule="auto"/>
+      </w:pPr>
+      <w:r>
+        <w:rPr>
+          <w:rFonts w:ascii="Consolas" w:hAnsi="Consolas" w:eastAsia="Consolas" w:cs="Consolas"/>
+          <w:sz w:val="15"/>
+          <w:noProof/>
+        </w:rPr>
+        <w:t>if LABEL_SET in ('revised', 'acacia'):</w:t>
+      </w:r>
+    </w:p>
+    <w:p>
+      <w:pPr>
+        <w:spacing w:before="0" w:after="0" w:line="240" w:lineRule="auto"/>
+      </w:pPr>
+      <w:r>
+        <w:rPr>
+          <w:rFonts w:ascii="Consolas" w:hAnsi="Consolas" w:eastAsia="Consolas" w:cs="Consolas"/>
+          <w:sz w:val="15"/>
+          <w:noProof/>
+        </w:rPr>
+        <w:t xml:space="preserve">    NEW = REVISED if LABEL_SET == 'revised' else ACACIA</w:t>
+      </w:r>
+    </w:p>
+    <w:p>
+      <w:pPr>
+        <w:spacing w:before="0" w:after="0" w:line="240" w:lineRule="auto"/>
+      </w:pPr>
+      <w:r>
+        <w:rPr>
+          <w:rFonts w:ascii="Consolas" w:hAnsi="Consolas" w:eastAsia="Consolas" w:cs="Consolas"/>
+          <w:sz w:val="15"/>
+          <w:noProof/>
+        </w:rPr>
+        <w:t xml:space="preserve">    LABELS = [lab[:6] + (NEW.get((lab[0], lab[3]), lab[6]),) + lab[7:] for lab in LABELS]</w:t>
       </w:r>
     </w:p>
     <w:p>

</xml_diff>

<commit_message>
Fig 2a/2b: general class labels for an Acacia sample; band assignments and text in Word
Co-Authored-By: Claude Opus 5.5 <noreply@anthropic.com>
Claude-Session: https://claude.ai/code/session_01L8hQ8e5u5KmaH4dD9snyRw
</commit_message>
<xml_diff>
--- a/Acacia_Fig2_MeanSD_Code.docx
+++ b/Acacia_Fig2_MeanSD_Code.docx
@@ -1238,6 +1238,45 @@
           <w:sz w:val="15"/>
           <w:noProof/>
         </w:rPr>
+        <w:t xml:space="preserve">         # general class names (LABEL_SET = 'general')</w:t>
+      </w:r>
+    </w:p>
+    <w:p>
+      <w:pPr>
+        <w:spacing w:before="0" w:after="0" w:line="240" w:lineRule="auto"/>
+      </w:pPr>
+      <w:r>
+        <w:rPr>
+          <w:rFonts w:ascii="Consolas" w:hAnsi="Consolas" w:eastAsia="Consolas" w:cs="Consolas"/>
+          <w:sz w:val="15"/>
+          <w:noProof/>
+        </w:rPr>
+        <w:t xml:space="preserve">         'Phenolics/Proteins': [('Phenolics/', GOLD), ('Proteins', PURPLE)],</w:t>
+      </w:r>
+    </w:p>
+    <w:p>
+      <w:pPr>
+        <w:spacing w:before="0" w:after="0" w:line="240" w:lineRule="auto"/>
+      </w:pPr>
+      <w:r>
+        <w:rPr>
+          <w:rFonts w:ascii="Consolas" w:hAnsi="Consolas" w:eastAsia="Consolas" w:cs="Consolas"/>
+          <w:sz w:val="15"/>
+          <w:noProof/>
+        </w:rPr>
+        <w:t xml:space="preserve">         'Polysacch./Proteins': [('Polysacch./', GREEN), ('Proteins', PURPLE)],</w:t>
+      </w:r>
+    </w:p>
+    <w:p>
+      <w:pPr>
+        <w:spacing w:before="0" w:after="0" w:line="240" w:lineRule="auto"/>
+      </w:pPr>
+      <w:r>
+        <w:rPr>
+          <w:rFonts w:ascii="Consolas" w:hAnsi="Consolas" w:eastAsia="Consolas" w:cs="Consolas"/>
+          <w:sz w:val="15"/>
+          <w:noProof/>
+        </w:rPr>
         <w:t xml:space="preserve">         None: []}</w:t>
       </w:r>
     </w:p>
@@ -1939,7 +1978,33 @@
           <w:sz w:val="15"/>
           <w:noProof/>
         </w:rPr>
-        <w:t>LABEL_SET = 'acacia'</w:t>
+        <w:t>#   'general'  = class names only (Proteins, Nucleic Acids, Lipids, Phenolics, Polysacch.)</w:t>
+      </w:r>
+    </w:p>
+    <w:p>
+      <w:pPr>
+        <w:spacing w:before="0" w:after="0" w:line="240" w:lineRule="auto"/>
+      </w:pPr>
+      <w:r>
+        <w:rPr>
+          <w:rFonts w:ascii="Consolas" w:hAnsi="Consolas" w:eastAsia="Consolas" w:cs="Consolas"/>
+          <w:sz w:val="15"/>
+          <w:noProof/>
+        </w:rPr>
+        <w:t>#                for an Acacia sample; vibrations and references in the band table (Word)</w:t>
+      </w:r>
+    </w:p>
+    <w:p>
+      <w:pPr>
+        <w:spacing w:before="0" w:after="0" w:line="240" w:lineRule="auto"/>
+      </w:pPr>
+      <w:r>
+        <w:rPr>
+          <w:rFonts w:ascii="Consolas" w:hAnsi="Consolas" w:eastAsia="Consolas" w:cs="Consolas"/>
+          <w:sz w:val="15"/>
+          <w:noProof/>
+        </w:rPr>
+        <w:t>LABEL_SET = 'general'</w:t>
       </w:r>
     </w:p>
     <w:p>
@@ -2199,20 +2264,72 @@
           <w:sz w:val="15"/>
           <w:noProof/>
         </w:rPr>
-        <w:t>if LABEL_SET in ('revised', 'acacia'):</w:t>
-      </w:r>
-    </w:p>
-    <w:p>
-      <w:pPr>
-        <w:spacing w:before="0" w:after="0" w:line="240" w:lineRule="auto"/>
-      </w:pPr>
-      <w:r>
-        <w:rPr>
-          <w:rFonts w:ascii="Consolas" w:hAnsi="Consolas" w:eastAsia="Consolas" w:cs="Consolas"/>
-          <w:sz w:val="15"/>
-          <w:noProof/>
-        </w:rPr>
-        <w:t xml:space="preserve">    NEW = REVISED if LABEL_SET == 'revised' else ACACIA</w:t>
+        <w:t>GENERAL = {('fingerprint', 843): 'Polysacch./Proteins',                          # 855 (EV)</w:t>
+      </w:r>
+    </w:p>
+    <w:p>
+      <w:pPr>
+        <w:spacing w:before="0" w:after="0" w:line="240" w:lineRule="auto"/>
+      </w:pPr>
+      <w:r>
+        <w:rPr>
+          <w:rFonts w:ascii="Consolas" w:hAnsi="Consolas" w:eastAsia="Consolas" w:cs="Consolas"/>
+          <w:sz w:val="15"/>
+          <w:noProof/>
+        </w:rPr>
+        <w:t xml:space="preserve">           ('fingerprint', 1149): 'Phenolics/Proteins', ('fingerprint', 1157): 'Phenolics/Proteins',  # 1162 / 1169</w:t>
+      </w:r>
+    </w:p>
+    <w:p>
+      <w:pPr>
+        <w:spacing w:before="0" w:after="0" w:line="240" w:lineRule="auto"/>
+      </w:pPr>
+      <w:r>
+        <w:rPr>
+          <w:rFonts w:ascii="Consolas" w:hAnsi="Consolas" w:eastAsia="Consolas" w:cs="Consolas"/>
+          <w:sz w:val="15"/>
+          <w:noProof/>
+        </w:rPr>
+        <w:t xml:space="preserve">           ('fingerprint', 1361): 'Polysacch./Proteins', ('fingerprint', 1373): 'Polysacch./Proteins',  # 1373 / 1385</w:t>
+      </w:r>
+    </w:p>
+    <w:p>
+      <w:pPr>
+        <w:spacing w:before="0" w:after="0" w:line="240" w:lineRule="auto"/>
+      </w:pPr>
+      <w:r>
+        <w:rPr>
+          <w:rFonts w:ascii="Consolas" w:hAnsi="Consolas" w:eastAsia="Consolas" w:cs="Consolas"/>
+          <w:sz w:val="15"/>
+          <w:noProof/>
+        </w:rPr>
+        <w:t xml:space="preserve">           ('fingerprint', 1591): 'Phenolics', ('fingerprint', 1595): 'Phenolics'}  # 1603 / 1607 (minor proteins)</w:t>
+      </w:r>
+    </w:p>
+    <w:p>
+      <w:pPr>
+        <w:spacing w:before="0" w:after="0" w:line="240" w:lineRule="auto"/>
+      </w:pPr>
+      <w:r>
+        <w:rPr>
+          <w:rFonts w:ascii="Consolas" w:hAnsi="Consolas" w:eastAsia="Consolas" w:cs="Consolas"/>
+          <w:sz w:val="15"/>
+          <w:noProof/>
+        </w:rPr>
+        <w:t>if LABEL_SET in ('revised', 'acacia', 'general'):</w:t>
+      </w:r>
+    </w:p>
+    <w:p>
+      <w:pPr>
+        <w:spacing w:before="0" w:after="0" w:line="240" w:lineRule="auto"/>
+      </w:pPr>
+      <w:r>
+        <w:rPr>
+          <w:rFonts w:ascii="Consolas" w:hAnsi="Consolas" w:eastAsia="Consolas" w:cs="Consolas"/>
+          <w:sz w:val="15"/>
+          <w:noProof/>
+        </w:rPr>
+        <w:t xml:space="preserve">    NEW = {'revised': REVISED, 'acacia': ACACIA, 'general': GENERAL}[LABEL_SET]</w:t>
       </w:r>
     </w:p>
     <w:p>

</xml_diff>